<commit_message>
docs: align oral report, ERD and methodology with current API state (80 endpoints, 14 tables, migrations 001-012)
</commit_message>
<xml_diff>
--- a/alumni_crm_api/Preparation_Oral_Stage_CRM_Alumni.docx
+++ b/alumni_crm_api/Preparation_Oral_Stage_CRM_Alumni.docx
@@ -45,7 +45,7 @@
           <w:i/>
           <w:sz w:val="20"/>
         </w:rPr>
-        <w:t>Document généré le 10/08/2026</w:t>
+        <w:t>Document généré le 22/08/2026</w:t>
       </w:r>
     </w:p>
     <w:p>
@@ -132,7 +132,7 @@
     </w:p>
     <w:p>
       <w:r>
-        <w:t>Le projet a été développé dans le cadre d'un stage de formation, réalisé au sein de l'établissement scolaire. La durée du stage n'est pas explicitement renseignée dans le code source, mais l'évolution progressive du projet — visible à travers les 5 migrations SQL numérotées (001 à 006, avec un numéro 003 absent), la refactorisation de l'architecture en modules, et la structuration du README en « 4 axes de la revue » — témoigne d'un travail mené sur plusieurs semaines avec des livrables itératifs.</w:t>
+        <w:t>Le projet a été développé dans le cadre d'un stage de formation, réalisé au sein de l'établissement scolaire. La durée du stage n'est pas explicitement renseignée dans le code source, mais l'évolution progressive du projet — visible à travers les 12 migrations SQL numérotées (001 à 012, numérotation continue), la refactorisation de l'architecture en modules, et la structuration du README en « 4 axes de la revue » — témoigne d'un travail mené sur plusieurs semaines avec des livrables itératifs.</w:t>
       </w:r>
     </w:p>
     <w:p>
@@ -248,7 +248,7 @@
     </w:p>
     <w:p>
       <w:r>
-        <w:t>Conception du modèle relationnel complet de la base de données, depuis le MCD jusqu'au SQL PostgreSQL. Le schéma comprend 11 tables (voir section 3 pour le détail). Les migrations sont numérotées et traquées via une table schema_migrations, démontrant une démarche structurée d'évolution de la base.</w:t>
+        <w:t>Conception du modèle relationnel complet de la base de données, depuis le MCD jusqu'au SQL PostgreSQL. Le schéma comprend 14 tables — 12 tables métier complétées par les tables techniques otp_codes et schema_migrations (voir section 6 pour le détail). Les migrations sont numérotées et traquées via une table schema_migrations, démontrant une démarche structurée d'évolution de la base.</w:t>
       </w:r>
     </w:p>
     <w:p>
@@ -270,6 +270,14 @@
       </w:pPr>
       <w:r>
         <w:t>Table CONSENTEMENT_RGPD avec champs : date, type (ex: PROFIL_ALUMNI), statut (ACCORD/REFUS), canal de collecte</w:t>
+      </w:r>
+    </w:p>
+    <w:p>
+      <w:pPr>
+        <w:pStyle w:val="ListBullet"/>
+      </w:pPr>
+      <w:r>
+        <w:t>Workflow de demandes RGPD : les alumni créent des demandes d'export ou de suppression ; l'admin les prend en charge (verrou anti-traitement parallèle), les traite (décision traitee/rejetee), avec actions groupées (bulk) et export</w:t>
       </w:r>
     </w:p>
     <w:p>
@@ -322,7 +330,7 @@
         <w:pStyle w:val="ListBullet"/>
       </w:pPr>
       <w:r>
-        <w:t>30+ endpoints RESTful couvrant toutes les entités métier</w:t>
+        <w:t>80 endpoints RESTful couvrant toutes les entités métier</w:t>
       </w:r>
     </w:p>
     <w:p>
@@ -395,6 +403,14 @@
       </w:pPr>
       <w:r>
         <w:t>Nettoyage de la base : détection des orphelins et doublons avec mode dry-run</w:t>
+      </w:r>
+    </w:p>
+    <w:p>
+      <w:pPr>
+        <w:pStyle w:val="ListBullet"/>
+      </w:pPr>
+      <w:r>
+        <w:t>Newsletter ciblée : envoi uniquement aux alumni ayant un consentement newsletter actif</w:t>
       </w:r>
     </w:p>
     <w:p>
@@ -476,7 +492,7 @@
         <w:pStyle w:val="ListBullet"/>
       </w:pPr>
       <w:r>
-        <w:t>Migration 004 : Tables QUESTIONNAIRE, QUESTION, REPONSE_QUESTIONNAIRE → Système de questionnaires annuels</w:t>
+        <w:t>Migration 003 : Tables QUESTIONNAIRE, QUESTION, REPONSE_QUESTIONNAIRE → Système de questionnaires annuels</w:t>
       </w:r>
     </w:p>
     <w:p>
@@ -484,7 +500,7 @@
         <w:pStyle w:val="ListBullet"/>
       </w:pPr>
       <w:r>
-        <w:t>Migration 005 : Colonne tag sur QUESTION → Identification des KPI</w:t>
+        <w:t>Migration 004 : Colonne tag sur QUESTION → Identification des KPI</w:t>
       </w:r>
     </w:p>
     <w:p>
@@ -492,7 +508,63 @@
         <w:pStyle w:val="ListBullet"/>
       </w:pPr>
       <w:r>
-        <w:t>Migration 006 : Colonne conditionnee_statut_emploi → Questions conditionnelles</w:t>
+        <w:t>Migration 005 : Colonne conditionnee_statut_emploi → Questions conditionnelles</w:t>
+      </w:r>
+    </w:p>
+    <w:p>
+      <w:pPr>
+        <w:pStyle w:val="ListBullet"/>
+      </w:pPr>
+      <w:r>
+        <w:t>Migration 006 : Contrainte UNIQUE (id_etudiant, type_consentement) + upsert ON CONFLICT → Fiabilisation des consentements</w:t>
+      </w:r>
+    </w:p>
+    <w:p>
+      <w:pPr>
+        <w:pStyle w:val="ListBullet"/>
+      </w:pPr>
+      <w:r>
+        <w:t>Migration 007 : Table DEMANDE_RGPD (+ colonne acteur sur AUDIT_LOG) → Demandes d'export/suppression des alumni</w:t>
+      </w:r>
+    </w:p>
+    <w:p>
+      <w:pPr>
+        <w:pStyle w:val="ListBullet"/>
+      </w:pPr>
+      <w:r>
+        <w:t>Migration 008 : Colonne date_anonymisation sur ETUDIANT → Purge RGPD différée des comptes anonymisés</w:t>
+      </w:r>
+    </w:p>
+    <w:p>
+      <w:pPr>
+        <w:pStyle w:val="ListBullet"/>
+      </w:pPr>
+      <w:r>
+        <w:t>Migration 009 : Statuts étendus de DEMANDE_RGPD (en_traitement) + prise en charge par un admin</w:t>
+      </w:r>
+    </w:p>
+    <w:p>
+      <w:pPr>
+        <w:pStyle w:val="ListBullet"/>
+      </w:pPr>
+      <w:r>
+        <w:t>Migration 010 : Contrainte UNIQUE sur email_academique → Anti-doublons de comptes</w:t>
+      </w:r>
+    </w:p>
+    <w:p>
+      <w:pPr>
+        <w:pStyle w:val="ListBullet"/>
+      </w:pPr>
+      <w:r>
+        <w:t>Migration 011 : Harmonisation du ON DELETE CASCADE sur REPONSE_QUESTIONNAIRE.id_etudiant → Fix du drift migration 003 / base live</w:t>
+      </w:r>
+    </w:p>
+    <w:p>
+      <w:pPr>
+        <w:pStyle w:val="ListBullet"/>
+      </w:pPr>
+      <w:r>
+        <w:t>Migration 012 : Colonne salary_annuel sur EXPERIENCE_PRO → Distinction salaire mensuel / annuel</w:t>
       </w:r>
     </w:p>
     <w:p>
@@ -529,7 +601,7 @@
         <w:pStyle w:val="ListBullet"/>
       </w:pPr>
       <w:r>
-        <w:t>Schéma de BDD terminé : 11 tables, toutes les relations et contraintes en place</w:t>
+        <w:t>Schéma de BDD terminé : 14 tables (12 métier + 2 techniques), toutes les relations et contraintes en place</w:t>
       </w:r>
     </w:p>
     <w:p>
@@ -537,7 +609,7 @@
         <w:pStyle w:val="ListBullet"/>
       </w:pPr>
       <w:r>
-        <w:t>API fonctionnelle : 30+ endpoints testables via Swagger UI (/docs)</w:t>
+        <w:t>API fonctionnelle : 80 endpoints testables via Swagger UI (/docs)</w:t>
       </w:r>
     </w:p>
     <w:p>
@@ -546,6 +618,14 @@
       </w:pPr>
       <w:r>
         <w:t>Authentification opérationnelle : OTP par email (mode console en dev, mode Resend en production) + auth admin par code</w:t>
+      </w:r>
+    </w:p>
+    <w:p>
+      <w:pPr>
+        <w:pStyle w:val="ListBullet"/>
+      </w:pPr>
+      <w:r>
+        <w:t>Workflow RGPD opérationnel : demandes d'export/suppression avec prise en charge admin, anonymisation, purge différée (script purge.py)</w:t>
       </w:r>
     </w:p>
     <w:p>
@@ -662,7 +742,7 @@
               <w:rPr>
                 <w:sz w:val="18"/>
               </w:rPr>
-              <w:t>Tables BDD</w:t>
+              <w:t>Tables métier</w:t>
             </w:r>
           </w:p>
         </w:tc>
@@ -676,7 +756,7 @@
               <w:rPr>
                 <w:sz w:val="18"/>
               </w:rPr>
-              <w:t>11</w:t>
+              <w:t>12</w:t>
             </w:r>
           </w:p>
         </w:tc>
@@ -690,7 +770,7 @@
               <w:rPr>
                 <w:sz w:val="18"/>
               </w:rPr>
-              <w:t>PROMOTION, ETUDIANT, ENTREPRISE, EXPERIENCE_PRO, CERTIFICATION, OBTIENT, CONSENTEMENT_RGPD, QUESTIONNAIRE, QUESTION, REPONSE_QUESTIONNAIRE, AUDIT_LOG</w:t>
+              <w:t>PROMOTION, ETUDIANT, ENTREPRISE, EXPERIENCE_PRO, CERTIFICATION, OBTIENT, CONSENTEMENT_RGPD, QUESTIONNAIRE, QUESTION, REPONSE_QUESTIONNAIRE, DEMANDE_RGPD, AUDIT_LOG</w:t>
             </w:r>
           </w:p>
         </w:tc>
@@ -705,7 +785,7 @@
               <w:rPr>
                 <w:sz w:val="18"/>
               </w:rPr>
-              <w:t>Tables supplémentaires</w:t>
+              <w:t>Tables techniques</w:t>
             </w:r>
           </w:p>
         </w:tc>
@@ -761,7 +841,7 @@
               <w:rPr>
                 <w:sz w:val="18"/>
               </w:rPr>
-              <w:t>30+</w:t>
+              <w:t>80</w:t>
             </w:r>
           </w:p>
         </w:tc>
@@ -775,7 +855,7 @@
               <w:rPr>
                 <w:sz w:val="18"/>
               </w:rPr>
-              <w:t>Répartis dans 12 routers</w:t>
+              <w:t>Répartis dans 15 routers (+ route racine)</w:t>
             </w:r>
           </w:p>
         </w:tc>
@@ -803,20 +883,20 @@
               <w:rPr>
                 <w:sz w:val="18"/>
               </w:rPr>
-              <w:t>15</w:t>
-            </w:r>
-          </w:p>
-        </w:tc>
-        <w:tc>
-          <w:tcPr>
-            <w:tcW w:type="dxa" w:w="2880"/>
-          </w:tcPr>
-          <w:p>
-            <w:r>
-              <w:rPr>
-                <w:sz w:val="18"/>
-              </w:rPr>
-              <w:t>nom, prenom, email, email_academique, telephone, date_naissance, parcours_anterieur, date_inscription, id_promotion, address, city, country, linkedin, availability_status, skills (JSONB)</w:t>
+              <w:t>16</w:t>
+            </w:r>
+          </w:p>
+        </w:tc>
+        <w:tc>
+          <w:tcPr>
+            <w:tcW w:type="dxa" w:w="2880"/>
+          </w:tcPr>
+          <w:p>
+            <w:r>
+              <w:rPr>
+                <w:sz w:val="18"/>
+              </w:rPr>
+              <w:t>nom, prenom, email, email_academique, telephone, date_naissance, parcours_anterieur, date_inscription, id_promotion, address, city, country, linkedin, availability_status, skills (JSONB), date_anonymisation (RGPD)</w:t>
             </w:r>
           </w:p>
         </w:tc>
@@ -846,7 +926,7 @@
               <w:rPr>
                 <w:sz w:val="18"/>
               </w:rPr>
-              <w:t>5</w:t>
+              <w:t>12</w:t>
             </w:r>
           </w:p>
         </w:tc>
@@ -860,7 +940,7 @@
               <w:rPr>
                 <w:sz w:val="18"/>
               </w:rPr>
-              <w:t>001_audit_log, 002_alumni_profile_fields, 004_questionnaire_annuel, 005_question_tag, 006_question_statut_emploi</w:t>
+              <w:t>001_audit_log, 002_alumni_profile_fields, 003_questionnaire_annuel, 004_question_tag, 005_question_statut_emploi, 006_consentement_upsert, 007_demande_rgpd, 008_purge_anonymises, 009_demande_rgpd_statuts, 010_email_academique_unique, 011_fix_reponse_questionnaire_cascade, 012_salary_annuel</w:t>
             </w:r>
           </w:p>
         </w:tc>
@@ -1103,7 +1183,15 @@
         <w:pStyle w:val="ListBullet"/>
       </w:pPr>
       <w:r>
-        <w:t>Salaire moyen par promotion</w:t>
+        <w:t>Salaire moyen par promotion, calculé sur le salaire annuel si renseigné, sinon sur le salaire saisi</w:t>
+      </w:r>
+    </w:p>
+    <w:p>
+      <w:pPr>
+        <w:pStyle w:val="ListBullet"/>
+      </w:pPr>
+      <w:r>
+        <w:t>Salaire minimum / maximum (fourchette dynamique du dashboard), sur le même périmètre que le salaire moyen</w:t>
       </w:r>
     </w:p>
     <w:p>
@@ -1136,6 +1224,14 @@
       </w:pPr>
       <w:r>
         <w:t>Répartition par secteur d'activité</w:t>
+      </w:r>
+    </w:p>
+    <w:p>
+      <w:pPr>
+        <w:pStyle w:val="ListBullet"/>
+      </w:pPr>
+      <w:r>
+        <w:t>Répartition des postes en cours par type de contrat (CDI, CDD, alternance...)</w:t>
       </w:r>
     </w:p>
     <w:p>
@@ -1340,7 +1436,7 @@
               <w:rPr>
                 <w:sz w:val="18"/>
               </w:rPr>
-              <w:t>Base de données PostgreSQL relationnelle avec 11 tables, API REST FastAPI avec 30+ endpoints, import/export Excel</w:t>
+              <w:t>Base de données PostgreSQL relationnelle avec 14 tables, API REST FastAPI avec 80 endpoints, import/export Excel</w:t>
             </w:r>
           </w:p>
         </w:tc>
@@ -1425,7 +1521,7 @@
               <w:rPr>
                 <w:sz w:val="18"/>
               </w:rPr>
-              <w:t>Table CONSENTEMENT_RGPD (date, type, statut ACCORD/REFUS, canal). Anonymisation logique (UPDATE, pas DELETE) des données personnelles et salariales. Vérification du consentement avant archivage</w:t>
+              <w:t>Table CONSENTEMENT_RGPD (date, type, statut ACCORD/REFUS, canal). Demandes d'export/suppression avec workflow admin (prise en charge, traitement, actions groupées). Anonymisation logique (UPDATE, pas DELETE) des données personnelles et salariales, puis purge définitive différée. Vérification du consentement avant archivage</w:t>
             </w:r>
           </w:p>
         </w:tc>
@@ -1439,7 +1535,7 @@
               <w:rPr>
                 <w:sz w:val="18"/>
               </w:rPr>
-              <w:t>routers/rgpd.py, routers/cleanup.py</w:t>
+              <w:t>routers/rgpd.py, routers/demandes_rgpd.py, routers/cleanup.py, purge.py</w:t>
             </w:r>
           </w:p>
         </w:tc>
@@ -2194,6 +2290,48 @@
               <w:rPr>
                 <w:sz w:val="18"/>
               </w:rPr>
+              <w:t>Purge RGPD</w:t>
+            </w:r>
+          </w:p>
+        </w:tc>
+        <w:tc>
+          <w:tcPr>
+            <w:tcW w:type="dxa" w:w="2880"/>
+          </w:tcPr>
+          <w:p>
+            <w:r>
+              <w:rPr>
+                <w:sz w:val="18"/>
+              </w:rPr>
+              <w:t>Script CLI purge.py</w:t>
+            </w:r>
+          </w:p>
+        </w:tc>
+        <w:tc>
+          <w:tcPr>
+            <w:tcW w:type="dxa" w:w="2880"/>
+          </w:tcPr>
+          <w:p>
+            <w:r>
+              <w:rPr>
+                <w:sz w:val="18"/>
+              </w:rPr>
+              <w:t>Suppression définitive différée des comptes anonymisés (--dry-run possible)</w:t>
+            </w:r>
+          </w:p>
+        </w:tc>
+      </w:tr>
+      <w:tr>
+        <w:tc>
+          <w:tcPr>
+            <w:tcW w:type="dxa" w:w="2880"/>
+            <w:shd w:fill="E8EFF7" w:val="clear"/>
+          </w:tcPr>
+          <w:p>
+            <w:r>
+              <w:rPr>
+                <w:sz w:val="18"/>
+              </w:rPr>
               <w:t>Frontend (implémenté)</w:t>
             </w:r>
           </w:p>
@@ -2201,6 +2339,7 @@
         <w:tc>
           <w:tcPr>
             <w:tcW w:type="dxa" w:w="2880"/>
+            <w:shd w:fill="E8EFF7" w:val="clear"/>
           </w:tcPr>
           <w:p>
             <w:r>
@@ -2214,6 +2353,7 @@
         <w:tc>
           <w:tcPr>
             <w:tcW w:type="dxa" w:w="2880"/>
+            <w:shd w:fill="E8EFF7" w:val="clear"/>
           </w:tcPr>
           <w:p>
             <w:r>
@@ -2268,7 +2408,7 @@
         <w:pStyle w:val="ListBullet"/>
       </w:pPr>
       <w:r>
-        <w:t>Maintenabilité (découpage du fichier unique en 12 routers domain-specific)</w:t>
+        <w:t>Maintenabilité (découpage du fichier unique en 15 routers domain-specific)</w:t>
       </w:r>
     </w:p>
     <w:p>
@@ -2520,7 +2660,7 @@
               <w:rPr>
                 <w:sz w:val="18"/>
               </w:rPr>
-              <w:t>Expérience professionnelle (poste, contrat, salaire)</w:t>
+              <w:t>Expérience professionnelle (poste, contrat, salaire mensuel et annuel)</w:t>
             </w:r>
           </w:p>
         </w:tc>
@@ -2648,7 +2788,7 @@
               <w:rPr>
                 <w:sz w:val="18"/>
               </w:rPr>
-              <w:t>Enregistrement de consentement</w:t>
+              <w:t>Enregistrement de consentement (UNIQUE id_etudiant + type, upsert)</w:t>
             </w:r>
           </w:p>
         </w:tc>
@@ -2677,33 +2817,33 @@
               <w:rPr>
                 <w:sz w:val="18"/>
               </w:rPr>
-              <w:t>QUESTIONNAIRE</w:t>
-            </w:r>
-          </w:p>
-        </w:tc>
-        <w:tc>
-          <w:tcPr>
-            <w:tcW w:type="dxa" w:w="2880"/>
-          </w:tcPr>
-          <w:p>
-            <w:r>
-              <w:rPr>
-                <w:sz w:val="18"/>
-              </w:rPr>
-              <w:t>Questionnaire annuel</w:t>
-            </w:r>
-          </w:p>
-        </w:tc>
-        <w:tc>
-          <w:tcPr>
-            <w:tcW w:type="dxa" w:w="2880"/>
-          </w:tcPr>
-          <w:p>
-            <w:r>
-              <w:rPr>
-                <w:sz w:val="18"/>
-              </w:rPr>
-              <w:t>—</w:t>
+              <w:t>DEMANDE_RGPD</w:t>
+            </w:r>
+          </w:p>
+        </w:tc>
+        <w:tc>
+          <w:tcPr>
+            <w:tcW w:type="dxa" w:w="2880"/>
+          </w:tcPr>
+          <w:p>
+            <w:r>
+              <w:rPr>
+                <w:sz w:val="18"/>
+              </w:rPr>
+              <w:t>Demande d'export ou de suppression RGPD (statuts : envoyee, en_traitement, traitee, rejetee ; snapshot identité conservé)</w:t>
+            </w:r>
+          </w:p>
+        </w:tc>
+        <w:tc>
+          <w:tcPr>
+            <w:tcW w:type="dxa" w:w="2880"/>
+          </w:tcPr>
+          <w:p>
+            <w:r>
+              <w:rPr>
+                <w:sz w:val="18"/>
+              </w:rPr>
+              <w:t>id_etudiant → ETUDIANT (SET NULL)</w:t>
             </w:r>
           </w:p>
         </w:tc>
@@ -2719,7 +2859,7 @@
               <w:rPr>
                 <w:sz w:val="18"/>
               </w:rPr>
-              <w:t>QUESTION</w:t>
+              <w:t>QUESTIONNAIRE</w:t>
             </w:r>
           </w:p>
         </w:tc>
@@ -2733,7 +2873,7 @@
               <w:rPr>
                 <w:sz w:val="18"/>
               </w:rPr>
-              <w:t>Question d'un questionnaire</w:t>
+              <w:t>Questionnaire annuel</w:t>
             </w:r>
           </w:p>
         </w:tc>
@@ -2747,7 +2887,7 @@
               <w:rPr>
                 <w:sz w:val="18"/>
               </w:rPr>
-              <w:t>id_questionnaire → QUESTIONNAIRE (CASCADE)</w:t>
+              <w:t>—</w:t>
             </w:r>
           </w:p>
         </w:tc>
@@ -2762,33 +2902,33 @@
               <w:rPr>
                 <w:sz w:val="18"/>
               </w:rPr>
-              <w:t>REPONSE_QUESTIONNAIRE</w:t>
-            </w:r>
-          </w:p>
-        </w:tc>
-        <w:tc>
-          <w:tcPr>
-            <w:tcW w:type="dxa" w:w="2880"/>
-          </w:tcPr>
-          <w:p>
-            <w:r>
-              <w:rPr>
-                <w:sz w:val="18"/>
-              </w:rPr>
-              <w:t>Réponse d'un alumni à un questionnaire</w:t>
-            </w:r>
-          </w:p>
-        </w:tc>
-        <w:tc>
-          <w:tcPr>
-            <w:tcW w:type="dxa" w:w="2880"/>
-          </w:tcPr>
-          <w:p>
-            <w:r>
-              <w:rPr>
-                <w:sz w:val="18"/>
-              </w:rPr>
-              <w:t>id_etudiant → ETUDIANT, id_questionnaire → QUESTIONNAIRE</w:t>
+              <w:t>QUESTION</w:t>
+            </w:r>
+          </w:p>
+        </w:tc>
+        <w:tc>
+          <w:tcPr>
+            <w:tcW w:type="dxa" w:w="2880"/>
+          </w:tcPr>
+          <w:p>
+            <w:r>
+              <w:rPr>
+                <w:sz w:val="18"/>
+              </w:rPr>
+              <w:t>Question d'un questionnaire</w:t>
+            </w:r>
+          </w:p>
+        </w:tc>
+        <w:tc>
+          <w:tcPr>
+            <w:tcW w:type="dxa" w:w="2880"/>
+          </w:tcPr>
+          <w:p>
+            <w:r>
+              <w:rPr>
+                <w:sz w:val="18"/>
+              </w:rPr>
+              <w:t>id_questionnaire → QUESTIONNAIRE (CASCADE)</w:t>
             </w:r>
           </w:p>
         </w:tc>
@@ -2804,6 +2944,49 @@
               <w:rPr>
                 <w:sz w:val="18"/>
               </w:rPr>
+              <w:t>REPONSE_QUESTIONNAIRE</w:t>
+            </w:r>
+          </w:p>
+        </w:tc>
+        <w:tc>
+          <w:tcPr>
+            <w:tcW w:type="dxa" w:w="2880"/>
+            <w:shd w:fill="E8EFF7" w:val="clear"/>
+          </w:tcPr>
+          <w:p>
+            <w:r>
+              <w:rPr>
+                <w:sz w:val="18"/>
+              </w:rPr>
+              <w:t>Réponse d'un alumni à un questionnaire</w:t>
+            </w:r>
+          </w:p>
+        </w:tc>
+        <w:tc>
+          <w:tcPr>
+            <w:tcW w:type="dxa" w:w="2880"/>
+            <w:shd w:fill="E8EFF7" w:val="clear"/>
+          </w:tcPr>
+          <w:p>
+            <w:r>
+              <w:rPr>
+                <w:sz w:val="18"/>
+              </w:rPr>
+              <w:t>id_etudiant → ETUDIANT (CASCADE), id_questionnaire → QUESTIONNAIRE</w:t>
+            </w:r>
+          </w:p>
+        </w:tc>
+      </w:tr>
+      <w:tr>
+        <w:tc>
+          <w:tcPr>
+            <w:tcW w:type="dxa" w:w="2880"/>
+          </w:tcPr>
+          <w:p>
+            <w:r>
+              <w:rPr>
+                <w:sz w:val="18"/>
+              </w:rPr>
               <w:t>AUDIT_LOG</w:t>
             </w:r>
           </w:p>
@@ -2811,6 +2994,34 @@
         <w:tc>
           <w:tcPr>
             <w:tcW w:type="dxa" w:w="2880"/>
+          </w:tcPr>
+          <w:p>
+            <w:r>
+              <w:rPr>
+                <w:sz w:val="18"/>
+              </w:rPr>
+              <w:t>Journal des opérations de nettoyage, RGPD et purge</w:t>
+            </w:r>
+          </w:p>
+        </w:tc>
+        <w:tc>
+          <w:tcPr>
+            <w:tcW w:type="dxa" w:w="2880"/>
+          </w:tcPr>
+          <w:p>
+            <w:r>
+              <w:rPr>
+                <w:sz w:val="18"/>
+              </w:rPr>
+              <w:t>—</w:t>
+            </w:r>
+          </w:p>
+        </w:tc>
+      </w:tr>
+      <w:tr>
+        <w:tc>
+          <w:tcPr>
+            <w:tcW w:type="dxa" w:w="2880"/>
             <w:shd w:fill="E8EFF7" w:val="clear"/>
           </w:tcPr>
           <w:p>
@@ -2818,7 +3029,7 @@
               <w:rPr>
                 <w:sz w:val="18"/>
               </w:rPr>
-              <w:t>Journal des opérations de nettoyage</w:t>
+              <w:t>OTP_CODES</w:t>
             </w:r>
           </w:p>
         </w:tc>
@@ -2826,6 +3037,61 @@
           <w:tcPr>
             <w:tcW w:type="dxa" w:w="2880"/>
             <w:shd w:fill="E8EFF7" w:val="clear"/>
+          </w:tcPr>
+          <w:p>
+            <w:r>
+              <w:rPr>
+                <w:sz w:val="18"/>
+              </w:rPr>
+              <w:t>Table technique : codes OTP de connexion alumni (hash, TTL 10 min, tentatives)</w:t>
+            </w:r>
+          </w:p>
+        </w:tc>
+        <w:tc>
+          <w:tcPr>
+            <w:tcW w:type="dxa" w:w="2880"/>
+            <w:shd w:fill="E8EFF7" w:val="clear"/>
+          </w:tcPr>
+          <w:p>
+            <w:r>
+              <w:rPr>
+                <w:sz w:val="18"/>
+              </w:rPr>
+              <w:t>—</w:t>
+            </w:r>
+          </w:p>
+        </w:tc>
+      </w:tr>
+      <w:tr>
+        <w:tc>
+          <w:tcPr>
+            <w:tcW w:type="dxa" w:w="2880"/>
+          </w:tcPr>
+          <w:p>
+            <w:r>
+              <w:rPr>
+                <w:sz w:val="18"/>
+              </w:rPr>
+              <w:t>SCHEMA_MIGRATIONS</w:t>
+            </w:r>
+          </w:p>
+        </w:tc>
+        <w:tc>
+          <w:tcPr>
+            <w:tcW w:type="dxa" w:w="2880"/>
+          </w:tcPr>
+          <w:p>
+            <w:r>
+              <w:rPr>
+                <w:sz w:val="18"/>
+              </w:rPr>
+              <w:t>Table technique : tracking des migrations SQL exécutées</w:t>
+            </w:r>
+          </w:p>
+        </w:tc>
+        <w:tc>
+          <w:tcPr>
+            <w:tcW w:type="dxa" w:w="2880"/>
           </w:tcPr>
           <w:p>
             <w:r>
@@ -2969,7 +3235,7 @@
         <w:pStyle w:val="ListBullet"/>
       </w:pPr>
       <w:r>
-        <w:t>Architecture modulaire : le fichier unique initial (~590 lignes) a été découpé en 12 routers domain-specific</w:t>
+        <w:t>Architecture modulaire : le fichier unique initial (~590 lignes) a été découpé en 15 routers domain-specific</w:t>
       </w:r>
     </w:p>
     <w:p>
@@ -3298,7 +3564,7 @@
               <w:rPr>
                 <w:sz w:val="18"/>
               </w:rPr>
-              <w:t>DELETE</w:t>
+              <w:t>PUT</w:t>
             </w:r>
           </w:p>
         </w:tc>
@@ -3326,7 +3592,7 @@
               <w:rPr>
                 <w:sz w:val="18"/>
               </w:rPr>
-              <w:t>Supprimer une promotion (+ cascade)</w:t>
+              <w:t>Mettre à jour une promotion</w:t>
             </w:r>
           </w:p>
         </w:tc>
@@ -3341,33 +3607,33 @@
               <w:rPr>
                 <w:sz w:val="18"/>
               </w:rPr>
-              <w:t>POST</w:t>
-            </w:r>
-          </w:p>
-        </w:tc>
-        <w:tc>
-          <w:tcPr>
-            <w:tcW w:type="dxa" w:w="2880"/>
-          </w:tcPr>
-          <w:p>
-            <w:r>
-              <w:rPr>
-                <w:sz w:val="18"/>
-              </w:rPr>
-              <w:t>/etudiants/</w:t>
-            </w:r>
-          </w:p>
-        </w:tc>
-        <w:tc>
-          <w:tcPr>
-            <w:tcW w:type="dxa" w:w="2880"/>
-          </w:tcPr>
-          <w:p>
-            <w:r>
-              <w:rPr>
-                <w:sz w:val="18"/>
-              </w:rPr>
-              <w:t>Créer un étudiant</w:t>
+              <w:t>DELETE</w:t>
+            </w:r>
+          </w:p>
+        </w:tc>
+        <w:tc>
+          <w:tcPr>
+            <w:tcW w:type="dxa" w:w="2880"/>
+          </w:tcPr>
+          <w:p>
+            <w:r>
+              <w:rPr>
+                <w:sz w:val="18"/>
+              </w:rPr>
+              <w:t>/promotions/{id}</w:t>
+            </w:r>
+          </w:p>
+        </w:tc>
+        <w:tc>
+          <w:tcPr>
+            <w:tcW w:type="dxa" w:w="2880"/>
+          </w:tcPr>
+          <w:p>
+            <w:r>
+              <w:rPr>
+                <w:sz w:val="18"/>
+              </w:rPr>
+              <w:t>Supprimer une promotion (+ cascade)</w:t>
             </w:r>
           </w:p>
         </w:tc>
@@ -3383,7 +3649,7 @@
               <w:rPr>
                 <w:sz w:val="18"/>
               </w:rPr>
-              <w:t>GET</w:t>
+              <w:t>POST</w:t>
             </w:r>
           </w:p>
         </w:tc>
@@ -3411,7 +3677,7 @@
               <w:rPr>
                 <w:sz w:val="18"/>
               </w:rPr>
-              <w:t>Lister les étudiants (paginé, recherchable)</w:t>
+              <w:t>Créer un étudiant</w:t>
             </w:r>
           </w:p>
         </w:tc>
@@ -3439,20 +3705,20 @@
               <w:rPr>
                 <w:sz w:val="18"/>
               </w:rPr>
-              <w:t>/etudiants/{id}</w:t>
-            </w:r>
-          </w:p>
-        </w:tc>
-        <w:tc>
-          <w:tcPr>
-            <w:tcW w:type="dxa" w:w="2880"/>
-          </w:tcPr>
-          <w:p>
-            <w:r>
-              <w:rPr>
-                <w:sz w:val="18"/>
-              </w:rPr>
-              <w:t>Détail d'un étudiant (avec promo, entreprise, nb exp)</w:t>
+              <w:t>/etudiants/</w:t>
+            </w:r>
+          </w:p>
+        </w:tc>
+        <w:tc>
+          <w:tcPr>
+            <w:tcW w:type="dxa" w:w="2880"/>
+          </w:tcPr>
+          <w:p>
+            <w:r>
+              <w:rPr>
+                <w:sz w:val="18"/>
+              </w:rPr>
+              <w:t>Lister les étudiants (paginé, recherchable)</w:t>
             </w:r>
           </w:p>
         </w:tc>
@@ -3468,7 +3734,7 @@
               <w:rPr>
                 <w:sz w:val="18"/>
               </w:rPr>
-              <w:t>PUT</w:t>
+              <w:t>GET</w:t>
             </w:r>
           </w:p>
         </w:tc>
@@ -3496,7 +3762,7 @@
               <w:rPr>
                 <w:sz w:val="18"/>
               </w:rPr>
-              <w:t>Mise à jour complète d'un étudiant</w:t>
+              <w:t>Détail d'un étudiant (avec promo, entreprise, nb exp)</w:t>
             </w:r>
           </w:p>
         </w:tc>
@@ -3511,7 +3777,7 @@
               <w:rPr>
                 <w:sz w:val="18"/>
               </w:rPr>
-              <w:t>PATCH</w:t>
+              <w:t>PUT</w:t>
             </w:r>
           </w:p>
         </w:tc>
@@ -3537,7 +3803,7 @@
               <w:rPr>
                 <w:sz w:val="18"/>
               </w:rPr>
-              <w:t>Mise à jour partielle d'un étudiant</w:t>
+              <w:t>Mise à jour complète d'un étudiant</w:t>
             </w:r>
           </w:p>
         </w:tc>
@@ -3553,7 +3819,7 @@
               <w:rPr>
                 <w:sz w:val="18"/>
               </w:rPr>
-              <w:t>DELETE</w:t>
+              <w:t>PATCH</w:t>
             </w:r>
           </w:p>
         </w:tc>
@@ -3581,7 +3847,7 @@
               <w:rPr>
                 <w:sz w:val="18"/>
               </w:rPr>
-              <w:t>Supprimer un étudiant (+ cascade)</w:t>
+              <w:t>Mise à jour partielle d'un étudiant</w:t>
             </w:r>
           </w:p>
         </w:tc>
@@ -3596,33 +3862,33 @@
               <w:rPr>
                 <w:sz w:val="18"/>
               </w:rPr>
-              <w:t>POST</w:t>
-            </w:r>
-          </w:p>
-        </w:tc>
-        <w:tc>
-          <w:tcPr>
-            <w:tcW w:type="dxa" w:w="2880"/>
-          </w:tcPr>
-          <w:p>
-            <w:r>
-              <w:rPr>
-                <w:sz w:val="18"/>
-              </w:rPr>
-              <w:t>/entreprises/</w:t>
-            </w:r>
-          </w:p>
-        </w:tc>
-        <w:tc>
-          <w:tcPr>
-            <w:tcW w:type="dxa" w:w="2880"/>
-          </w:tcPr>
-          <w:p>
-            <w:r>
-              <w:rPr>
-                <w:sz w:val="18"/>
-              </w:rPr>
-              <w:t>Créer une entreprise</w:t>
+              <w:t>DELETE</w:t>
+            </w:r>
+          </w:p>
+        </w:tc>
+        <w:tc>
+          <w:tcPr>
+            <w:tcW w:type="dxa" w:w="2880"/>
+          </w:tcPr>
+          <w:p>
+            <w:r>
+              <w:rPr>
+                <w:sz w:val="18"/>
+              </w:rPr>
+              <w:t>/etudiants/{id}</w:t>
+            </w:r>
+          </w:p>
+        </w:tc>
+        <w:tc>
+          <w:tcPr>
+            <w:tcW w:type="dxa" w:w="2880"/>
+          </w:tcPr>
+          <w:p>
+            <w:r>
+              <w:rPr>
+                <w:sz w:val="18"/>
+              </w:rPr>
+              <w:t>Supprimer un étudiant (+ cascade)</w:t>
             </w:r>
           </w:p>
         </w:tc>
@@ -3638,7 +3904,7 @@
               <w:rPr>
                 <w:sz w:val="18"/>
               </w:rPr>
-              <w:t>GET</w:t>
+              <w:t>POST</w:t>
             </w:r>
           </w:p>
         </w:tc>
@@ -3652,7 +3918,7 @@
               <w:rPr>
                 <w:sz w:val="18"/>
               </w:rPr>
-              <w:t>/entreprises/</w:t>
+              <w:t>/etudiants/{id}/anonymiser</w:t>
             </w:r>
           </w:p>
         </w:tc>
@@ -3666,7 +3932,7 @@
               <w:rPr>
                 <w:sz w:val="18"/>
               </w:rPr>
-              <w:t>Lister les entreprises (paginé, filtrable)</w:t>
+              <w:t>Anonymisation RGPD d'un étudiant (admin)</w:t>
             </w:r>
           </w:p>
         </w:tc>
@@ -3681,33 +3947,33 @@
               <w:rPr>
                 <w:sz w:val="18"/>
               </w:rPr>
-              <w:t>GET</w:t>
-            </w:r>
-          </w:p>
-        </w:tc>
-        <w:tc>
-          <w:tcPr>
-            <w:tcW w:type="dxa" w:w="2880"/>
-          </w:tcPr>
-          <w:p>
-            <w:r>
-              <w:rPr>
-                <w:sz w:val="18"/>
-              </w:rPr>
-              <w:t>/entreprises/{id}</w:t>
-            </w:r>
-          </w:p>
-        </w:tc>
-        <w:tc>
-          <w:tcPr>
-            <w:tcW w:type="dxa" w:w="2880"/>
-          </w:tcPr>
-          <w:p>
-            <w:r>
-              <w:rPr>
-                <w:sz w:val="18"/>
-              </w:rPr>
-              <w:t>Détail d'une entreprise</w:t>
+              <w:t>POST</w:t>
+            </w:r>
+          </w:p>
+        </w:tc>
+        <w:tc>
+          <w:tcPr>
+            <w:tcW w:type="dxa" w:w="2880"/>
+          </w:tcPr>
+          <w:p>
+            <w:r>
+              <w:rPr>
+                <w:sz w:val="18"/>
+              </w:rPr>
+              <w:t>/entreprises/</w:t>
+            </w:r>
+          </w:p>
+        </w:tc>
+        <w:tc>
+          <w:tcPr>
+            <w:tcW w:type="dxa" w:w="2880"/>
+          </w:tcPr>
+          <w:p>
+            <w:r>
+              <w:rPr>
+                <w:sz w:val="18"/>
+              </w:rPr>
+              <w:t>Créer une entreprise</w:t>
             </w:r>
           </w:p>
         </w:tc>
@@ -3723,7 +3989,7 @@
               <w:rPr>
                 <w:sz w:val="18"/>
               </w:rPr>
-              <w:t>PUT</w:t>
+              <w:t>GET</w:t>
             </w:r>
           </w:p>
         </w:tc>
@@ -3737,7 +4003,7 @@
               <w:rPr>
                 <w:sz w:val="18"/>
               </w:rPr>
-              <w:t>/entreprises/{id}</w:t>
+              <w:t>/entreprises/</w:t>
             </w:r>
           </w:p>
         </w:tc>
@@ -3751,7 +4017,7 @@
               <w:rPr>
                 <w:sz w:val="18"/>
               </w:rPr>
-              <w:t>Mettre à jour une entreprise</w:t>
+              <w:t>Lister les entreprises (paginé, filtrable)</w:t>
             </w:r>
           </w:p>
         </w:tc>
@@ -3766,7 +4032,7 @@
               <w:rPr>
                 <w:sz w:val="18"/>
               </w:rPr>
-              <w:t>DELETE</w:t>
+              <w:t>GET</w:t>
             </w:r>
           </w:p>
         </w:tc>
@@ -3792,7 +4058,7 @@
               <w:rPr>
                 <w:sz w:val="18"/>
               </w:rPr>
-              <w:t>Supprimer une entreprise</w:t>
+              <w:t>Détail d'une entreprise</w:t>
             </w:r>
           </w:p>
         </w:tc>
@@ -3808,7 +4074,7 @@
               <w:rPr>
                 <w:sz w:val="18"/>
               </w:rPr>
-              <w:t>GET</w:t>
+              <w:t>PUT</w:t>
             </w:r>
           </w:p>
         </w:tc>
@@ -3822,7 +4088,7 @@
               <w:rPr>
                 <w:sz w:val="18"/>
               </w:rPr>
-              <w:t>/etudiants/{id}/experiences</w:t>
+              <w:t>/entreprises/{id}</w:t>
             </w:r>
           </w:p>
         </w:tc>
@@ -3836,7 +4102,7 @@
               <w:rPr>
                 <w:sz w:val="18"/>
               </w:rPr>
-              <w:t>Expériences d'un étudiant</w:t>
+              <w:t>Mettre à jour une entreprise</w:t>
             </w:r>
           </w:p>
         </w:tc>
@@ -3851,33 +4117,33 @@
               <w:rPr>
                 <w:sz w:val="18"/>
               </w:rPr>
-              <w:t>GET</w:t>
-            </w:r>
-          </w:p>
-        </w:tc>
-        <w:tc>
-          <w:tcPr>
-            <w:tcW w:type="dxa" w:w="2880"/>
-          </w:tcPr>
-          <w:p>
-            <w:r>
-              <w:rPr>
-                <w:sz w:val="18"/>
-              </w:rPr>
-              <w:t>/experiences/</w:t>
-            </w:r>
-          </w:p>
-        </w:tc>
-        <w:tc>
-          <w:tcPr>
-            <w:tcW w:type="dxa" w:w="2880"/>
-          </w:tcPr>
-          <w:p>
-            <w:r>
-              <w:rPr>
-                <w:sz w:val="18"/>
-              </w:rPr>
-              <w:t>Rechercher des expériences (paginé, filtrable)</w:t>
+              <w:t>DELETE</w:t>
+            </w:r>
+          </w:p>
+        </w:tc>
+        <w:tc>
+          <w:tcPr>
+            <w:tcW w:type="dxa" w:w="2880"/>
+          </w:tcPr>
+          <w:p>
+            <w:r>
+              <w:rPr>
+                <w:sz w:val="18"/>
+              </w:rPr>
+              <w:t>/entreprises/{id}</w:t>
+            </w:r>
+          </w:p>
+        </w:tc>
+        <w:tc>
+          <w:tcPr>
+            <w:tcW w:type="dxa" w:w="2880"/>
+          </w:tcPr>
+          <w:p>
+            <w:r>
+              <w:rPr>
+                <w:sz w:val="18"/>
+              </w:rPr>
+              <w:t>Supprimer une entreprise</w:t>
             </w:r>
           </w:p>
         </w:tc>
@@ -3893,7 +4159,7 @@
               <w:rPr>
                 <w:sz w:val="18"/>
               </w:rPr>
-              <w:t>POST</w:t>
+              <w:t>GET</w:t>
             </w:r>
           </w:p>
         </w:tc>
@@ -3907,7 +4173,7 @@
               <w:rPr>
                 <w:sz w:val="18"/>
               </w:rPr>
-              <w:t>/experiences/</w:t>
+              <w:t>/etudiants/{id}/experiences</w:t>
             </w:r>
           </w:p>
         </w:tc>
@@ -3921,7 +4187,7 @@
               <w:rPr>
                 <w:sz w:val="18"/>
               </w:rPr>
-              <w:t>Créer une expérience</w:t>
+              <w:t>Expériences d'un étudiant</w:t>
             </w:r>
           </w:p>
         </w:tc>
@@ -3936,33 +4202,33 @@
               <w:rPr>
                 <w:sz w:val="18"/>
               </w:rPr>
-              <w:t>DELETE</w:t>
-            </w:r>
-          </w:p>
-        </w:tc>
-        <w:tc>
-          <w:tcPr>
-            <w:tcW w:type="dxa" w:w="2880"/>
-          </w:tcPr>
-          <w:p>
-            <w:r>
-              <w:rPr>
-                <w:sz w:val="18"/>
-              </w:rPr>
-              <w:t>/experiences/{id}</w:t>
-            </w:r>
-          </w:p>
-        </w:tc>
-        <w:tc>
-          <w:tcPr>
-            <w:tcW w:type="dxa" w:w="2880"/>
-          </w:tcPr>
-          <w:p>
-            <w:r>
-              <w:rPr>
-                <w:sz w:val="18"/>
-              </w:rPr>
-              <w:t>Supprimer une expérience</w:t>
+              <w:t>GET</w:t>
+            </w:r>
+          </w:p>
+        </w:tc>
+        <w:tc>
+          <w:tcPr>
+            <w:tcW w:type="dxa" w:w="2880"/>
+          </w:tcPr>
+          <w:p>
+            <w:r>
+              <w:rPr>
+                <w:sz w:val="18"/>
+              </w:rPr>
+              <w:t>/experiences/</w:t>
+            </w:r>
+          </w:p>
+        </w:tc>
+        <w:tc>
+          <w:tcPr>
+            <w:tcW w:type="dxa" w:w="2880"/>
+          </w:tcPr>
+          <w:p>
+            <w:r>
+              <w:rPr>
+                <w:sz w:val="18"/>
+              </w:rPr>
+              <w:t>Rechercher des expériences (paginé, filtrable)</w:t>
             </w:r>
           </w:p>
         </w:tc>
@@ -3992,7 +4258,7 @@
               <w:rPr>
                 <w:sz w:val="18"/>
               </w:rPr>
-              <w:t>/etudiants/{id}/experiences</w:t>
+              <w:t>/experiences/</w:t>
             </w:r>
           </w:p>
         </w:tc>
@@ -4006,7 +4272,7 @@
               <w:rPr>
                 <w:sz w:val="18"/>
               </w:rPr>
-              <w:t>Alumni ajoute une expérience</w:t>
+              <w:t>Créer une expérience</w:t>
             </w:r>
           </w:p>
         </w:tc>
@@ -4021,33 +4287,33 @@
               <w:rPr>
                 <w:sz w:val="18"/>
               </w:rPr>
-              <w:t>POST</w:t>
-            </w:r>
-          </w:p>
-        </w:tc>
-        <w:tc>
-          <w:tcPr>
-            <w:tcW w:type="dxa" w:w="2880"/>
-          </w:tcPr>
-          <w:p>
-            <w:r>
-              <w:rPr>
-                <w:sz w:val="18"/>
-              </w:rPr>
-              <w:t>/certifications/</w:t>
-            </w:r>
-          </w:p>
-        </w:tc>
-        <w:tc>
-          <w:tcPr>
-            <w:tcW w:type="dxa" w:w="2880"/>
-          </w:tcPr>
-          <w:p>
-            <w:r>
-              <w:rPr>
-                <w:sz w:val="18"/>
-              </w:rPr>
-              <w:t>Créer une certification</w:t>
+              <w:t>DELETE</w:t>
+            </w:r>
+          </w:p>
+        </w:tc>
+        <w:tc>
+          <w:tcPr>
+            <w:tcW w:type="dxa" w:w="2880"/>
+          </w:tcPr>
+          <w:p>
+            <w:r>
+              <w:rPr>
+                <w:sz w:val="18"/>
+              </w:rPr>
+              <w:t>/experiences/{id}</w:t>
+            </w:r>
+          </w:p>
+        </w:tc>
+        <w:tc>
+          <w:tcPr>
+            <w:tcW w:type="dxa" w:w="2880"/>
+          </w:tcPr>
+          <w:p>
+            <w:r>
+              <w:rPr>
+                <w:sz w:val="18"/>
+              </w:rPr>
+              <w:t>Supprimer une expérience</w:t>
             </w:r>
           </w:p>
         </w:tc>
@@ -4063,7 +4329,7 @@
               <w:rPr>
                 <w:sz w:val="18"/>
               </w:rPr>
-              <w:t>GET</w:t>
+              <w:t>POST</w:t>
             </w:r>
           </w:p>
         </w:tc>
@@ -4077,7 +4343,7 @@
               <w:rPr>
                 <w:sz w:val="18"/>
               </w:rPr>
-              <w:t>/certifications/</w:t>
+              <w:t>/etudiants/{id}/experiences</w:t>
             </w:r>
           </w:p>
         </w:tc>
@@ -4091,7 +4357,7 @@
               <w:rPr>
                 <w:sz w:val="18"/>
               </w:rPr>
-              <w:t>Lister les certifications</w:t>
+              <w:t>Alumni ajoute une expérience</w:t>
             </w:r>
           </w:p>
         </w:tc>
@@ -4106,33 +4372,33 @@
               <w:rPr>
                 <w:sz w:val="18"/>
               </w:rPr>
-              <w:t>DELETE</w:t>
-            </w:r>
-          </w:p>
-        </w:tc>
-        <w:tc>
-          <w:tcPr>
-            <w:tcW w:type="dxa" w:w="2880"/>
-          </w:tcPr>
-          <w:p>
-            <w:r>
-              <w:rPr>
-                <w:sz w:val="18"/>
-              </w:rPr>
-              <w:t>/certifications/{id}</w:t>
-            </w:r>
-          </w:p>
-        </w:tc>
-        <w:tc>
-          <w:tcPr>
-            <w:tcW w:type="dxa" w:w="2880"/>
-          </w:tcPr>
-          <w:p>
-            <w:r>
-              <w:rPr>
-                <w:sz w:val="18"/>
-              </w:rPr>
-              <w:t>Supprimer une certification</w:t>
+              <w:t>POST</w:t>
+            </w:r>
+          </w:p>
+        </w:tc>
+        <w:tc>
+          <w:tcPr>
+            <w:tcW w:type="dxa" w:w="2880"/>
+          </w:tcPr>
+          <w:p>
+            <w:r>
+              <w:rPr>
+                <w:sz w:val="18"/>
+              </w:rPr>
+              <w:t>/certifications/</w:t>
+            </w:r>
+          </w:p>
+        </w:tc>
+        <w:tc>
+          <w:tcPr>
+            <w:tcW w:type="dxa" w:w="2880"/>
+          </w:tcPr>
+          <w:p>
+            <w:r>
+              <w:rPr>
+                <w:sz w:val="18"/>
+              </w:rPr>
+              <w:t>Créer une certification</w:t>
             </w:r>
           </w:p>
         </w:tc>
@@ -4148,7 +4414,7 @@
               <w:rPr>
                 <w:sz w:val="18"/>
               </w:rPr>
-              <w:t>POST</w:t>
+              <w:t>GET</w:t>
             </w:r>
           </w:p>
         </w:tc>
@@ -4162,7 +4428,7 @@
               <w:rPr>
                 <w:sz w:val="18"/>
               </w:rPr>
-              <w:t>/etudiants-certifications/</w:t>
+              <w:t>/certifications/</w:t>
             </w:r>
           </w:p>
         </w:tc>
@@ -4176,7 +4442,7 @@
               <w:rPr>
                 <w:sz w:val="18"/>
               </w:rPr>
-              <w:t>Associer certification à un étudiant</w:t>
+              <w:t>Lister les certifications</w:t>
             </w:r>
           </w:p>
         </w:tc>
@@ -4204,20 +4470,20 @@
               <w:rPr>
                 <w:sz w:val="18"/>
               </w:rPr>
-              <w:t>/etudiants-certifications/</w:t>
-            </w:r>
-          </w:p>
-        </w:tc>
-        <w:tc>
-          <w:tcPr>
-            <w:tcW w:type="dxa" w:w="2880"/>
-          </w:tcPr>
-          <w:p>
-            <w:r>
-              <w:rPr>
-                <w:sz w:val="18"/>
-              </w:rPr>
-              <w:t>Dissocier certification d'un étudiant</w:t>
+              <w:t>/certifications/{id}</w:t>
+            </w:r>
+          </w:p>
+        </w:tc>
+        <w:tc>
+          <w:tcPr>
+            <w:tcW w:type="dxa" w:w="2880"/>
+          </w:tcPr>
+          <w:p>
+            <w:r>
+              <w:rPr>
+                <w:sz w:val="18"/>
+              </w:rPr>
+              <w:t>Supprimer une certification</w:t>
             </w:r>
           </w:p>
         </w:tc>
@@ -4233,7 +4499,7 @@
               <w:rPr>
                 <w:sz w:val="18"/>
               </w:rPr>
-              <w:t>GET</w:t>
+              <w:t>POST</w:t>
             </w:r>
           </w:p>
         </w:tc>
@@ -4247,7 +4513,7 @@
               <w:rPr>
                 <w:sz w:val="18"/>
               </w:rPr>
-              <w:t>/consentements/etudiant/{id}</w:t>
+              <w:t>/etudiants-certifications/</w:t>
             </w:r>
           </w:p>
         </w:tc>
@@ -4261,7 +4527,7 @@
               <w:rPr>
                 <w:sz w:val="18"/>
               </w:rPr>
-              <w:t>Historique des consentements RGPD</w:t>
+              <w:t>Associer certification à un étudiant</w:t>
             </w:r>
           </w:p>
         </w:tc>
@@ -4276,33 +4542,33 @@
               <w:rPr>
                 <w:sz w:val="18"/>
               </w:rPr>
-              <w:t>POST</w:t>
-            </w:r>
-          </w:p>
-        </w:tc>
-        <w:tc>
-          <w:tcPr>
-            <w:tcW w:type="dxa" w:w="2880"/>
-          </w:tcPr>
-          <w:p>
-            <w:r>
-              <w:rPr>
-                <w:sz w:val="18"/>
-              </w:rPr>
-              <w:t>/consentements/</w:t>
-            </w:r>
-          </w:p>
-        </w:tc>
-        <w:tc>
-          <w:tcPr>
-            <w:tcW w:type="dxa" w:w="2880"/>
-          </w:tcPr>
-          <w:p>
-            <w:r>
-              <w:rPr>
-                <w:sz w:val="18"/>
-              </w:rPr>
-              <w:t>Enregistrer un consentement</w:t>
+              <w:t>DELETE</w:t>
+            </w:r>
+          </w:p>
+        </w:tc>
+        <w:tc>
+          <w:tcPr>
+            <w:tcW w:type="dxa" w:w="2880"/>
+          </w:tcPr>
+          <w:p>
+            <w:r>
+              <w:rPr>
+                <w:sz w:val="18"/>
+              </w:rPr>
+              <w:t>/etudiants-certifications/</w:t>
+            </w:r>
+          </w:p>
+        </w:tc>
+        <w:tc>
+          <w:tcPr>
+            <w:tcW w:type="dxa" w:w="2880"/>
+          </w:tcPr>
+          <w:p>
+            <w:r>
+              <w:rPr>
+                <w:sz w:val="18"/>
+              </w:rPr>
+              <w:t>Dissocier certification d'un étudiant</w:t>
             </w:r>
           </w:p>
         </w:tc>
@@ -4318,7 +4584,7 @@
               <w:rPr>
                 <w:sz w:val="18"/>
               </w:rPr>
-              <w:t>DELETE</w:t>
+              <w:t>GET</w:t>
             </w:r>
           </w:p>
         </w:tc>
@@ -4332,7 +4598,7 @@
               <w:rPr>
                 <w:sz w:val="18"/>
               </w:rPr>
-              <w:t>/consentements/{id}</w:t>
+              <w:t>/etudiants/{id}/certifications</w:t>
             </w:r>
           </w:p>
         </w:tc>
@@ -4346,7 +4612,7 @@
               <w:rPr>
                 <w:sz w:val="18"/>
               </w:rPr>
-              <w:t>Supprimer un consentement</w:t>
+              <w:t>Certifications d'un étudiant (alumni ou admin)</w:t>
             </w:r>
           </w:p>
         </w:tc>
@@ -4361,33 +4627,33 @@
               <w:rPr>
                 <w:sz w:val="18"/>
               </w:rPr>
-              <w:t>GET</w:t>
-            </w:r>
-          </w:p>
-        </w:tc>
-        <w:tc>
-          <w:tcPr>
-            <w:tcW w:type="dxa" w:w="2880"/>
-          </w:tcPr>
-          <w:p>
-            <w:r>
-              <w:rPr>
-                <w:sz w:val="18"/>
-              </w:rPr>
-              <w:t>/admin/etudiants/filtrer</w:t>
-            </w:r>
-          </w:p>
-        </w:tc>
-        <w:tc>
-          <w:tcPr>
-            <w:tcW w:type="dxa" w:w="2880"/>
-          </w:tcPr>
-          <w:p>
-            <w:r>
-              <w:rPr>
-                <w:sz w:val="18"/>
-              </w:rPr>
-              <w:t>Filtrage avancé des alumni</w:t>
+              <w:t>POST</w:t>
+            </w:r>
+          </w:p>
+        </w:tc>
+        <w:tc>
+          <w:tcPr>
+            <w:tcW w:type="dxa" w:w="2880"/>
+          </w:tcPr>
+          <w:p>
+            <w:r>
+              <w:rPr>
+                <w:sz w:val="18"/>
+              </w:rPr>
+              <w:t>/etudiants/{id}/certifications</w:t>
+            </w:r>
+          </w:p>
+        </w:tc>
+        <w:tc>
+          <w:tcPr>
+            <w:tcW w:type="dxa" w:w="2880"/>
+          </w:tcPr>
+          <w:p>
+            <w:r>
+              <w:rPr>
+                <w:sz w:val="18"/>
+              </w:rPr>
+              <w:t>Alumni ajoute une certification</w:t>
             </w:r>
           </w:p>
         </w:tc>
@@ -4403,7 +4669,7 @@
               <w:rPr>
                 <w:sz w:val="18"/>
               </w:rPr>
-              <w:t>GET</w:t>
+              <w:t>DELETE</w:t>
             </w:r>
           </w:p>
         </w:tc>
@@ -4417,7 +4683,7 @@
               <w:rPr>
                 <w:sz w:val="18"/>
               </w:rPr>
-              <w:t>/admin/indicateurs</w:t>
+              <w:t>/etudiants/{id}/certifications/{id_cert}</w:t>
             </w:r>
           </w:p>
         </w:tc>
@@ -4431,7 +4697,7 @@
               <w:rPr>
                 <w:sz w:val="18"/>
               </w:rPr>
-              <w:t>Indicateurs d'insertion (taux emploi, salaire...)</w:t>
+              <w:t>Alumni retire une certification</w:t>
             </w:r>
           </w:p>
         </w:tc>
@@ -4459,20 +4725,20 @@
               <w:rPr>
                 <w:sz w:val="18"/>
               </w:rPr>
-              <w:t>/admin/indicateurs/secteurs</w:t>
-            </w:r>
-          </w:p>
-        </w:tc>
-        <w:tc>
-          <w:tcPr>
-            <w:tcW w:type="dxa" w:w="2880"/>
-          </w:tcPr>
-          <w:p>
-            <w:r>
-              <w:rPr>
-                <w:sz w:val="18"/>
-              </w:rPr>
-              <w:t>Répartition par secteur</w:t>
+              <w:t>/consentements/etudiant/{id}</w:t>
+            </w:r>
+          </w:p>
+        </w:tc>
+        <w:tc>
+          <w:tcPr>
+            <w:tcW w:type="dxa" w:w="2880"/>
+          </w:tcPr>
+          <w:p>
+            <w:r>
+              <w:rPr>
+                <w:sz w:val="18"/>
+              </w:rPr>
+              <w:t>Historique des consentements RGPD</w:t>
             </w:r>
           </w:p>
         </w:tc>
@@ -4488,7 +4754,7 @@
               <w:rPr>
                 <w:sz w:val="18"/>
               </w:rPr>
-              <w:t>GET</w:t>
+              <w:t>POST</w:t>
             </w:r>
           </w:p>
         </w:tc>
@@ -4502,7 +4768,7 @@
               <w:rPr>
                 <w:sz w:val="18"/>
               </w:rPr>
-              <w:t>/admin/indicateurs/kpi-tag</w:t>
+              <w:t>/consentements/</w:t>
             </w:r>
           </w:p>
         </w:tc>
@@ -4516,7 +4782,7 @@
               <w:rPr>
                 <w:sz w:val="18"/>
               </w:rPr>
-              <w:t>KPI par tag de question</w:t>
+              <w:t>Enregistrer un consentement</w:t>
             </w:r>
           </w:p>
         </w:tc>
@@ -4531,33 +4797,33 @@
               <w:rPr>
                 <w:sz w:val="18"/>
               </w:rPr>
-              <w:t>GET</w:t>
-            </w:r>
-          </w:p>
-        </w:tc>
-        <w:tc>
-          <w:tcPr>
-            <w:tcW w:type="dxa" w:w="2880"/>
-          </w:tcPr>
-          <w:p>
-            <w:r>
-              <w:rPr>
-                <w:sz w:val="18"/>
-              </w:rPr>
-              <w:t>/admin/cleanup/orphelins</w:t>
-            </w:r>
-          </w:p>
-        </w:tc>
-        <w:tc>
-          <w:tcPr>
-            <w:tcW w:type="dxa" w:w="2880"/>
-          </w:tcPr>
-          <w:p>
-            <w:r>
-              <w:rPr>
-                <w:sz w:val="18"/>
-              </w:rPr>
-              <w:t>Détection des orphelins (dry-run)</w:t>
+              <w:t>DELETE</w:t>
+            </w:r>
+          </w:p>
+        </w:tc>
+        <w:tc>
+          <w:tcPr>
+            <w:tcW w:type="dxa" w:w="2880"/>
+          </w:tcPr>
+          <w:p>
+            <w:r>
+              <w:rPr>
+                <w:sz w:val="18"/>
+              </w:rPr>
+              <w:t>/consentements/{id}</w:t>
+            </w:r>
+          </w:p>
+        </w:tc>
+        <w:tc>
+          <w:tcPr>
+            <w:tcW w:type="dxa" w:w="2880"/>
+          </w:tcPr>
+          <w:p>
+            <w:r>
+              <w:rPr>
+                <w:sz w:val="18"/>
+              </w:rPr>
+              <w:t>Supprimer un consentement</w:t>
             </w:r>
           </w:p>
         </w:tc>
@@ -4573,7 +4839,7 @@
               <w:rPr>
                 <w:sz w:val="18"/>
               </w:rPr>
-              <w:t>DELETE</w:t>
+              <w:t>POST</w:t>
             </w:r>
           </w:p>
         </w:tc>
@@ -4587,7 +4853,7 @@
               <w:rPr>
                 <w:sz w:val="18"/>
               </w:rPr>
-              <w:t>/admin/cleanup/orphelins</w:t>
+              <w:t>/rgpd/demandes</w:t>
             </w:r>
           </w:p>
         </w:tc>
@@ -4601,7 +4867,7 @@
               <w:rPr>
                 <w:sz w:val="18"/>
               </w:rPr>
-              <w:t>Suppression des orphelins</w:t>
+              <w:t>Créer une demande RGPD (export/suppression) — alumni</w:t>
             </w:r>
           </w:p>
         </w:tc>
@@ -4629,20 +4895,20 @@
               <w:rPr>
                 <w:sz w:val="18"/>
               </w:rPr>
-              <w:t>/admin/cleanup/doublons</w:t>
-            </w:r>
-          </w:p>
-        </w:tc>
-        <w:tc>
-          <w:tcPr>
-            <w:tcW w:type="dxa" w:w="2880"/>
-          </w:tcPr>
-          <w:p>
-            <w:r>
-              <w:rPr>
-                <w:sz w:val="18"/>
-              </w:rPr>
-              <w:t>Détection des doublons (dry-run)</w:t>
+              <w:t>/rgpd/demandes/moi</w:t>
+            </w:r>
+          </w:p>
+        </w:tc>
+        <w:tc>
+          <w:tcPr>
+            <w:tcW w:type="dxa" w:w="2880"/>
+          </w:tcPr>
+          <w:p>
+            <w:r>
+              <w:rPr>
+                <w:sz w:val="18"/>
+              </w:rPr>
+              <w:t>Mes demandes RGPD — alumni</w:t>
             </w:r>
           </w:p>
         </w:tc>
@@ -4672,7 +4938,7 @@
               <w:rPr>
                 <w:sz w:val="18"/>
               </w:rPr>
-              <w:t>/admin/cleanup/doublons</w:t>
+              <w:t>/rgpd/demandes/{id}</w:t>
             </w:r>
           </w:p>
         </w:tc>
@@ -4686,7 +4952,7 @@
               <w:rPr>
                 <w:sz w:val="18"/>
               </w:rPr>
-              <w:t>Suppression des doublons</w:t>
+              <w:t>Annuler une demande RGPD — alumni</w:t>
             </w:r>
           </w:p>
         </w:tc>
@@ -4701,33 +4967,33 @@
               <w:rPr>
                 <w:sz w:val="18"/>
               </w:rPr>
-              <w:t>POST</w:t>
-            </w:r>
-          </w:p>
-        </w:tc>
-        <w:tc>
-          <w:tcPr>
-            <w:tcW w:type="dxa" w:w="2880"/>
-          </w:tcPr>
-          <w:p>
-            <w:r>
-              <w:rPr>
-                <w:sz w:val="18"/>
-              </w:rPr>
-              <w:t>/admin/cleanup/rgpd/archiver</w:t>
-            </w:r>
-          </w:p>
-        </w:tc>
-        <w:tc>
-          <w:tcPr>
-            <w:tcW w:type="dxa" w:w="2880"/>
-          </w:tcPr>
-          <w:p>
-            <w:r>
-              <w:rPr>
-                <w:sz w:val="18"/>
-              </w:rPr>
-              <w:t>Anonymisation RGPD</w:t>
+              <w:t>GET</w:t>
+            </w:r>
+          </w:p>
+        </w:tc>
+        <w:tc>
+          <w:tcPr>
+            <w:tcW w:type="dxa" w:w="2880"/>
+          </w:tcPr>
+          <w:p>
+            <w:r>
+              <w:rPr>
+                <w:sz w:val="18"/>
+              </w:rPr>
+              <w:t>/rgpd/export</w:t>
+            </w:r>
+          </w:p>
+        </w:tc>
+        <w:tc>
+          <w:tcPr>
+            <w:tcW w:type="dxa" w:w="2880"/>
+          </w:tcPr>
+          <w:p>
+            <w:r>
+              <w:rPr>
+                <w:sz w:val="18"/>
+              </w:rPr>
+              <w:t>Export immédiat de mes données (droit d'accès) — alumni</w:t>
             </w:r>
           </w:p>
         </w:tc>
@@ -4757,7 +5023,7 @@
               <w:rPr>
                 <w:sz w:val="18"/>
               </w:rPr>
-              <w:t>/admin/cleanup/audit</w:t>
+              <w:t>/admin/etudiants/filtrer</w:t>
             </w:r>
           </w:p>
         </w:tc>
@@ -4771,7 +5037,7 @@
               <w:rPr>
                 <w:sz w:val="18"/>
               </w:rPr>
-              <w:t>Historique des audits</w:t>
+              <w:t>Filtrage avancé des alumni</w:t>
             </w:r>
           </w:p>
         </w:tc>
@@ -4786,33 +5052,33 @@
               <w:rPr>
                 <w:sz w:val="18"/>
               </w:rPr>
-              <w:t>POST</w:t>
-            </w:r>
-          </w:p>
-        </w:tc>
-        <w:tc>
-          <w:tcPr>
-            <w:tcW w:type="dxa" w:w="2880"/>
-          </w:tcPr>
-          <w:p>
-            <w:r>
-              <w:rPr>
-                <w:sz w:val="18"/>
-              </w:rPr>
-              <w:t>/admin/questionnaires/</w:t>
-            </w:r>
-          </w:p>
-        </w:tc>
-        <w:tc>
-          <w:tcPr>
-            <w:tcW w:type="dxa" w:w="2880"/>
-          </w:tcPr>
-          <w:p>
-            <w:r>
-              <w:rPr>
-                <w:sz w:val="18"/>
-              </w:rPr>
-              <w:t>Créer un questionnaire</w:t>
+              <w:t>GET</w:t>
+            </w:r>
+          </w:p>
+        </w:tc>
+        <w:tc>
+          <w:tcPr>
+            <w:tcW w:type="dxa" w:w="2880"/>
+          </w:tcPr>
+          <w:p>
+            <w:r>
+              <w:rPr>
+                <w:sz w:val="18"/>
+              </w:rPr>
+              <w:t>/admin/indicateurs</w:t>
+            </w:r>
+          </w:p>
+        </w:tc>
+        <w:tc>
+          <w:tcPr>
+            <w:tcW w:type="dxa" w:w="2880"/>
+          </w:tcPr>
+          <w:p>
+            <w:r>
+              <w:rPr>
+                <w:sz w:val="18"/>
+              </w:rPr>
+              <w:t>Indicateurs d'insertion (taux emploi, salaire...)</w:t>
             </w:r>
           </w:p>
         </w:tc>
@@ -4842,7 +5108,7 @@
               <w:rPr>
                 <w:sz w:val="18"/>
               </w:rPr>
-              <w:t>/admin/questionnaires/</w:t>
+              <w:t>/admin/indicateurs/secteurs</w:t>
             </w:r>
           </w:p>
         </w:tc>
@@ -4856,7 +5122,7 @@
               <w:rPr>
                 <w:sz w:val="18"/>
               </w:rPr>
-              <w:t>Lister les questionnaires</w:t>
+              <w:t>Répartition par secteur</w:t>
             </w:r>
           </w:p>
         </w:tc>
@@ -4884,20 +5150,20 @@
               <w:rPr>
                 <w:sz w:val="18"/>
               </w:rPr>
-              <w:t>/admin/questionnaires/{id}</w:t>
-            </w:r>
-          </w:p>
-        </w:tc>
-        <w:tc>
-          <w:tcPr>
-            <w:tcW w:type="dxa" w:w="2880"/>
-          </w:tcPr>
-          <w:p>
-            <w:r>
-              <w:rPr>
-                <w:sz w:val="18"/>
-              </w:rPr>
-              <w:t>Détail d'un questionnaire</w:t>
+              <w:t>/admin/indicateurs/types-contrat</w:t>
+            </w:r>
+          </w:p>
+        </w:tc>
+        <w:tc>
+          <w:tcPr>
+            <w:tcW w:type="dxa" w:w="2880"/>
+          </w:tcPr>
+          <w:p>
+            <w:r>
+              <w:rPr>
+                <w:sz w:val="18"/>
+              </w:rPr>
+              <w:t>Répartition des postes en cours par type de contrat</w:t>
             </w:r>
           </w:p>
         </w:tc>
@@ -4913,7 +5179,7 @@
               <w:rPr>
                 <w:sz w:val="18"/>
               </w:rPr>
-              <w:t>PUT</w:t>
+              <w:t>GET</w:t>
             </w:r>
           </w:p>
         </w:tc>
@@ -4927,7 +5193,7 @@
               <w:rPr>
                 <w:sz w:val="18"/>
               </w:rPr>
-              <w:t>/admin/questionnaires/{id}</w:t>
+              <w:t>/admin/indicateurs/kpi-tag</w:t>
             </w:r>
           </w:p>
         </w:tc>
@@ -4941,7 +5207,7 @@
               <w:rPr>
                 <w:sz w:val="18"/>
               </w:rPr>
-              <w:t>Modifier un questionnaire</w:t>
+              <w:t>KPI par tag de question</w:t>
             </w:r>
           </w:p>
         </w:tc>
@@ -4956,33 +5222,33 @@
               <w:rPr>
                 <w:sz w:val="18"/>
               </w:rPr>
-              <w:t>DELETE</w:t>
-            </w:r>
-          </w:p>
-        </w:tc>
-        <w:tc>
-          <w:tcPr>
-            <w:tcW w:type="dxa" w:w="2880"/>
-          </w:tcPr>
-          <w:p>
-            <w:r>
-              <w:rPr>
-                <w:sz w:val="18"/>
-              </w:rPr>
-              <w:t>/admin/questionnaires/{id}</w:t>
-            </w:r>
-          </w:p>
-        </w:tc>
-        <w:tc>
-          <w:tcPr>
-            <w:tcW w:type="dxa" w:w="2880"/>
-          </w:tcPr>
-          <w:p>
-            <w:r>
-              <w:rPr>
-                <w:sz w:val="18"/>
-              </w:rPr>
-              <w:t>Supprimer un questionnaire</w:t>
+              <w:t>GET</w:t>
+            </w:r>
+          </w:p>
+        </w:tc>
+        <w:tc>
+          <w:tcPr>
+            <w:tcW w:type="dxa" w:w="2880"/>
+          </w:tcPr>
+          <w:p>
+            <w:r>
+              <w:rPr>
+                <w:sz w:val="18"/>
+              </w:rPr>
+              <w:t>/admin/indicateurs/kpi-tags</w:t>
+            </w:r>
+          </w:p>
+        </w:tc>
+        <w:tc>
+          <w:tcPr>
+            <w:tcW w:type="dxa" w:w="2880"/>
+          </w:tcPr>
+          <w:p>
+            <w:r>
+              <w:rPr>
+                <w:sz w:val="18"/>
+              </w:rPr>
+              <w:t>Tous les KPI par tag</w:t>
             </w:r>
           </w:p>
         </w:tc>
@@ -4998,7 +5264,7 @@
               <w:rPr>
                 <w:sz w:val="18"/>
               </w:rPr>
-              <w:t>PATCH</w:t>
+              <w:t>GET</w:t>
             </w:r>
           </w:p>
         </w:tc>
@@ -5012,7 +5278,7 @@
               <w:rPr>
                 <w:sz w:val="18"/>
               </w:rPr>
-              <w:t>/admin/questionnaires/{id}/desactiver</w:t>
+              <w:t>/admin/indicateurs/kpi-tags-actifs</w:t>
             </w:r>
           </w:p>
         </w:tc>
@@ -5026,7 +5292,7 @@
               <w:rPr>
                 <w:sz w:val="18"/>
               </w:rPr>
-              <w:t>Désactiver un questionnaire</w:t>
+              <w:t>Tags KPI disponibles (questions taguées actives)</w:t>
             </w:r>
           </w:p>
         </w:tc>
@@ -5041,33 +5307,33 @@
               <w:rPr>
                 <w:sz w:val="18"/>
               </w:rPr>
-              <w:t>PATCH</w:t>
-            </w:r>
-          </w:p>
-        </w:tc>
-        <w:tc>
-          <w:tcPr>
-            <w:tcW w:type="dxa" w:w="2880"/>
-          </w:tcPr>
-          <w:p>
-            <w:r>
-              <w:rPr>
-                <w:sz w:val="18"/>
-              </w:rPr>
-              <w:t>/admin/questionnaires/{id}/reactiver</w:t>
-            </w:r>
-          </w:p>
-        </w:tc>
-        <w:tc>
-          <w:tcPr>
-            <w:tcW w:type="dxa" w:w="2880"/>
-          </w:tcPr>
-          <w:p>
-            <w:r>
-              <w:rPr>
-                <w:sz w:val="18"/>
-              </w:rPr>
-              <w:t>Réactiver un questionnaire</w:t>
+              <w:t>GET</w:t>
+            </w:r>
+          </w:p>
+        </w:tc>
+        <w:tc>
+          <w:tcPr>
+            <w:tcW w:type="dxa" w:w="2880"/>
+          </w:tcPr>
+          <w:p>
+            <w:r>
+              <w:rPr>
+                <w:sz w:val="18"/>
+              </w:rPr>
+              <w:t>/admin/cleanup/orphelins</w:t>
+            </w:r>
+          </w:p>
+        </w:tc>
+        <w:tc>
+          <w:tcPr>
+            <w:tcW w:type="dxa" w:w="2880"/>
+          </w:tcPr>
+          <w:p>
+            <w:r>
+              <w:rPr>
+                <w:sz w:val="18"/>
+              </w:rPr>
+              <w:t>Détection des orphelins (dry-run)</w:t>
             </w:r>
           </w:p>
         </w:tc>
@@ -5083,7 +5349,7 @@
               <w:rPr>
                 <w:sz w:val="18"/>
               </w:rPr>
-              <w:t>GET</w:t>
+              <w:t>DELETE</w:t>
             </w:r>
           </w:p>
         </w:tc>
@@ -5097,7 +5363,7 @@
               <w:rPr>
                 <w:sz w:val="18"/>
               </w:rPr>
-              <w:t>/admin/questionnaires/{id}/reponses</w:t>
+              <w:t>/admin/cleanup/orphelins</w:t>
             </w:r>
           </w:p>
         </w:tc>
@@ -5111,7 +5377,7 @@
               <w:rPr>
                 <w:sz w:val="18"/>
               </w:rPr>
-              <w:t>Voir les réponses</w:t>
+              <w:t>Suppression des orphelins</w:t>
             </w:r>
           </w:p>
         </w:tc>
@@ -5139,20 +5405,20 @@
               <w:rPr>
                 <w:sz w:val="18"/>
               </w:rPr>
-              <w:t>/questionnaires/actif</w:t>
-            </w:r>
-          </w:p>
-        </w:tc>
-        <w:tc>
-          <w:tcPr>
-            <w:tcW w:type="dxa" w:w="2880"/>
-          </w:tcPr>
-          <w:p>
-            <w:r>
-              <w:rPr>
-                <w:sz w:val="18"/>
-              </w:rPr>
-              <w:t>Questionnaire actif (alumni)</w:t>
+              <w:t>/admin/cleanup/doublons</w:t>
+            </w:r>
+          </w:p>
+        </w:tc>
+        <w:tc>
+          <w:tcPr>
+            <w:tcW w:type="dxa" w:w="2880"/>
+          </w:tcPr>
+          <w:p>
+            <w:r>
+              <w:rPr>
+                <w:sz w:val="18"/>
+              </w:rPr>
+              <w:t>Détection des doublons (dry-run)</w:t>
             </w:r>
           </w:p>
         </w:tc>
@@ -5168,7 +5434,7 @@
               <w:rPr>
                 <w:sz w:val="18"/>
               </w:rPr>
-              <w:t>GET</w:t>
+              <w:t>DELETE</w:t>
             </w:r>
           </w:p>
         </w:tc>
@@ -5182,7 +5448,7 @@
               <w:rPr>
                 <w:sz w:val="18"/>
               </w:rPr>
-              <w:t>/questionnaires/etudiant/{id}/reponses</w:t>
+              <w:t>/admin/cleanup/doublons</w:t>
             </w:r>
           </w:p>
         </w:tc>
@@ -5196,7 +5462,7 @@
               <w:rPr>
                 <w:sz w:val="18"/>
               </w:rPr>
-              <w:t>Mes réponses (alumni)</w:t>
+              <w:t>Suppression des doublons</w:t>
             </w:r>
           </w:p>
         </w:tc>
@@ -5224,20 +5490,20 @@
               <w:rPr>
                 <w:sz w:val="18"/>
               </w:rPr>
-              <w:t>/questionnaires/{id}/repondre</w:t>
-            </w:r>
-          </w:p>
-        </w:tc>
-        <w:tc>
-          <w:tcPr>
-            <w:tcW w:type="dxa" w:w="2880"/>
-          </w:tcPr>
-          <w:p>
-            <w:r>
-              <w:rPr>
-                <w:sz w:val="18"/>
-              </w:rPr>
-              <w:t>Répondre au questionnaire (alumni)</w:t>
+              <w:t>/admin/cleanup/rgpd/archiver</w:t>
+            </w:r>
+          </w:p>
+        </w:tc>
+        <w:tc>
+          <w:tcPr>
+            <w:tcW w:type="dxa" w:w="2880"/>
+          </w:tcPr>
+          <w:p>
+            <w:r>
+              <w:rPr>
+                <w:sz w:val="18"/>
+              </w:rPr>
+              <w:t>Anonymisation RGPD</w:t>
             </w:r>
           </w:p>
         </w:tc>
@@ -5253,7 +5519,7 @@
               <w:rPr>
                 <w:sz w:val="18"/>
               </w:rPr>
-              <w:t>POST</w:t>
+              <w:t>GET</w:t>
             </w:r>
           </w:p>
         </w:tc>
@@ -5267,7 +5533,7 @@
               <w:rPr>
                 <w:sz w:val="18"/>
               </w:rPr>
-              <w:t>/import/excel</w:t>
+              <w:t>/admin/cleanup/audit</w:t>
             </w:r>
           </w:p>
         </w:tc>
@@ -5281,7 +5547,7 @@
               <w:rPr>
                 <w:sz w:val="18"/>
               </w:rPr>
-              <w:t>Importer des alumni depuis Excel</w:t>
+              <w:t>Historique des audits</w:t>
             </w:r>
           </w:p>
         </w:tc>
@@ -5309,20 +5575,20 @@
               <w:rPr>
                 <w:sz w:val="18"/>
               </w:rPr>
-              <w:t>/import/template</w:t>
-            </w:r>
-          </w:p>
-        </w:tc>
-        <w:tc>
-          <w:tcPr>
-            <w:tcW w:type="dxa" w:w="2880"/>
-          </w:tcPr>
-          <w:p>
-            <w:r>
-              <w:rPr>
-                <w:sz w:val="18"/>
-              </w:rPr>
-              <w:t>Télécharger le template d'import</w:t>
+              <w:t>/admin/demandes-rgpd</w:t>
+            </w:r>
+          </w:p>
+        </w:tc>
+        <w:tc>
+          <w:tcPr>
+            <w:tcW w:type="dxa" w:w="2880"/>
+          </w:tcPr>
+          <w:p>
+            <w:r>
+              <w:rPr>
+                <w:sz w:val="18"/>
+              </w:rPr>
+              <w:t>Lister les demandes RGPD (filtres statut/type)</w:t>
             </w:r>
           </w:p>
         </w:tc>
@@ -5352,7 +5618,7 @@
               <w:rPr>
                 <w:sz w:val="18"/>
               </w:rPr>
-              <w:t>/import/export/alumni</w:t>
+              <w:t>/admin/demandes-rgpd/{id}/export</w:t>
             </w:r>
           </w:p>
         </w:tc>
@@ -5366,7 +5632,7 @@
               <w:rPr>
                 <w:sz w:val="18"/>
               </w:rPr>
-              <w:t>Exporter tous les alumni en Excel</w:t>
+              <w:t>Exporter les données d'une demande</w:t>
             </w:r>
           </w:p>
         </w:tc>
@@ -5394,6 +5660,984 @@
               <w:rPr>
                 <w:sz w:val="18"/>
               </w:rPr>
+              <w:t>/admin/demandes-rgpd/{id}/prendre-en-charge</w:t>
+            </w:r>
+          </w:p>
+        </w:tc>
+        <w:tc>
+          <w:tcPr>
+            <w:tcW w:type="dxa" w:w="2880"/>
+          </w:tcPr>
+          <w:p>
+            <w:r>
+              <w:rPr>
+                <w:sz w:val="18"/>
+              </w:rPr>
+              <w:t>Prendre en charge une demande (verrou)</w:t>
+            </w:r>
+          </w:p>
+        </w:tc>
+      </w:tr>
+      <w:tr>
+        <w:tc>
+          <w:tcPr>
+            <w:tcW w:type="dxa" w:w="2880"/>
+            <w:shd w:fill="E8EFF7" w:val="clear"/>
+          </w:tcPr>
+          <w:p>
+            <w:r>
+              <w:rPr>
+                <w:sz w:val="18"/>
+              </w:rPr>
+              <w:t>POST</w:t>
+            </w:r>
+          </w:p>
+        </w:tc>
+        <w:tc>
+          <w:tcPr>
+            <w:tcW w:type="dxa" w:w="2880"/>
+            <w:shd w:fill="E8EFF7" w:val="clear"/>
+          </w:tcPr>
+          <w:p>
+            <w:r>
+              <w:rPr>
+                <w:sz w:val="18"/>
+              </w:rPr>
+              <w:t>/admin/demandes-rgpd/{id}/traiter</w:t>
+            </w:r>
+          </w:p>
+        </w:tc>
+        <w:tc>
+          <w:tcPr>
+            <w:tcW w:type="dxa" w:w="2880"/>
+            <w:shd w:fill="E8EFF7" w:val="clear"/>
+          </w:tcPr>
+          <w:p>
+            <w:r>
+              <w:rPr>
+                <w:sz w:val="18"/>
+              </w:rPr>
+              <w:t>Traiter une demande (traitee/rejetee)</w:t>
+            </w:r>
+          </w:p>
+        </w:tc>
+      </w:tr>
+      <w:tr>
+        <w:tc>
+          <w:tcPr>
+            <w:tcW w:type="dxa" w:w="2880"/>
+          </w:tcPr>
+          <w:p>
+            <w:r>
+              <w:rPr>
+                <w:sz w:val="18"/>
+              </w:rPr>
+              <w:t>POST</w:t>
+            </w:r>
+          </w:p>
+        </w:tc>
+        <w:tc>
+          <w:tcPr>
+            <w:tcW w:type="dxa" w:w="2880"/>
+          </w:tcPr>
+          <w:p>
+            <w:r>
+              <w:rPr>
+                <w:sz w:val="18"/>
+              </w:rPr>
+              <w:t>/admin/demandes-rgpd/bulk/traiter</w:t>
+            </w:r>
+          </w:p>
+        </w:tc>
+        <w:tc>
+          <w:tcPr>
+            <w:tcW w:type="dxa" w:w="2880"/>
+          </w:tcPr>
+          <w:p>
+            <w:r>
+              <w:rPr>
+                <w:sz w:val="18"/>
+              </w:rPr>
+              <w:t>Traiter plusieurs demandes en masse</w:t>
+            </w:r>
+          </w:p>
+        </w:tc>
+      </w:tr>
+      <w:tr>
+        <w:tc>
+          <w:tcPr>
+            <w:tcW w:type="dxa" w:w="2880"/>
+            <w:shd w:fill="E8EFF7" w:val="clear"/>
+          </w:tcPr>
+          <w:p>
+            <w:r>
+              <w:rPr>
+                <w:sz w:val="18"/>
+              </w:rPr>
+              <w:t>POST</w:t>
+            </w:r>
+          </w:p>
+        </w:tc>
+        <w:tc>
+          <w:tcPr>
+            <w:tcW w:type="dxa" w:w="2880"/>
+            <w:shd w:fill="E8EFF7" w:val="clear"/>
+          </w:tcPr>
+          <w:p>
+            <w:r>
+              <w:rPr>
+                <w:sz w:val="18"/>
+              </w:rPr>
+              <w:t>/admin/demandes-rgpd/bulk/delete</w:t>
+            </w:r>
+          </w:p>
+        </w:tc>
+        <w:tc>
+          <w:tcPr>
+            <w:tcW w:type="dxa" w:w="2880"/>
+            <w:shd w:fill="E8EFF7" w:val="clear"/>
+          </w:tcPr>
+          <w:p>
+            <w:r>
+              <w:rPr>
+                <w:sz w:val="18"/>
+              </w:rPr>
+              <w:t>Supprimer plusieurs demandes en masse</w:t>
+            </w:r>
+          </w:p>
+        </w:tc>
+      </w:tr>
+      <w:tr>
+        <w:tc>
+          <w:tcPr>
+            <w:tcW w:type="dxa" w:w="2880"/>
+          </w:tcPr>
+          <w:p>
+            <w:r>
+              <w:rPr>
+                <w:sz w:val="18"/>
+              </w:rPr>
+              <w:t>POST</w:t>
+            </w:r>
+          </w:p>
+        </w:tc>
+        <w:tc>
+          <w:tcPr>
+            <w:tcW w:type="dxa" w:w="2880"/>
+          </w:tcPr>
+          <w:p>
+            <w:r>
+              <w:rPr>
+                <w:sz w:val="18"/>
+              </w:rPr>
+              <w:t>/admin/demandes-rgpd/bulk/export</w:t>
+            </w:r>
+          </w:p>
+        </w:tc>
+        <w:tc>
+          <w:tcPr>
+            <w:tcW w:type="dxa" w:w="2880"/>
+          </w:tcPr>
+          <w:p>
+            <w:r>
+              <w:rPr>
+                <w:sz w:val="18"/>
+              </w:rPr>
+              <w:t>Exporter plusieurs demandes en masse</w:t>
+            </w:r>
+          </w:p>
+        </w:tc>
+      </w:tr>
+      <w:tr>
+        <w:tc>
+          <w:tcPr>
+            <w:tcW w:type="dxa" w:w="2880"/>
+            <w:shd w:fill="E8EFF7" w:val="clear"/>
+          </w:tcPr>
+          <w:p>
+            <w:r>
+              <w:rPr>
+                <w:sz w:val="18"/>
+              </w:rPr>
+              <w:t>GET</w:t>
+            </w:r>
+          </w:p>
+        </w:tc>
+        <w:tc>
+          <w:tcPr>
+            <w:tcW w:type="dxa" w:w="2880"/>
+            <w:shd w:fill="E8EFF7" w:val="clear"/>
+          </w:tcPr>
+          <w:p>
+            <w:r>
+              <w:rPr>
+                <w:sz w:val="18"/>
+              </w:rPr>
+              <w:t>/admin/demandes-rgpd/purge-anonymises</w:t>
+            </w:r>
+          </w:p>
+        </w:tc>
+        <w:tc>
+          <w:tcPr>
+            <w:tcW w:type="dxa" w:w="2880"/>
+            <w:shd w:fill="E8EFF7" w:val="clear"/>
+          </w:tcPr>
+          <w:p>
+            <w:r>
+              <w:rPr>
+                <w:sz w:val="18"/>
+              </w:rPr>
+              <w:t>Prévisualiser la purge des comptes anonymisés</w:t>
+            </w:r>
+          </w:p>
+        </w:tc>
+      </w:tr>
+      <w:tr>
+        <w:tc>
+          <w:tcPr>
+            <w:tcW w:type="dxa" w:w="2880"/>
+          </w:tcPr>
+          <w:p>
+            <w:r>
+              <w:rPr>
+                <w:sz w:val="18"/>
+              </w:rPr>
+              <w:t>POST</w:t>
+            </w:r>
+          </w:p>
+        </w:tc>
+        <w:tc>
+          <w:tcPr>
+            <w:tcW w:type="dxa" w:w="2880"/>
+          </w:tcPr>
+          <w:p>
+            <w:r>
+              <w:rPr>
+                <w:sz w:val="18"/>
+              </w:rPr>
+              <w:t>/admin/demandes-rgpd/purge-anonymises</w:t>
+            </w:r>
+          </w:p>
+        </w:tc>
+        <w:tc>
+          <w:tcPr>
+            <w:tcW w:type="dxa" w:w="2880"/>
+          </w:tcPr>
+          <w:p>
+            <w:r>
+              <w:rPr>
+                <w:sz w:val="18"/>
+              </w:rPr>
+              <w:t>Exécuter la purge des comptes anonymisés</w:t>
+            </w:r>
+          </w:p>
+        </w:tc>
+      </w:tr>
+      <w:tr>
+        <w:tc>
+          <w:tcPr>
+            <w:tcW w:type="dxa" w:w="2880"/>
+            <w:shd w:fill="E8EFF7" w:val="clear"/>
+          </w:tcPr>
+          <w:p>
+            <w:r>
+              <w:rPr>
+                <w:sz w:val="18"/>
+              </w:rPr>
+              <w:t>POST</w:t>
+            </w:r>
+          </w:p>
+        </w:tc>
+        <w:tc>
+          <w:tcPr>
+            <w:tcW w:type="dxa" w:w="2880"/>
+            <w:shd w:fill="E8EFF7" w:val="clear"/>
+          </w:tcPr>
+          <w:p>
+            <w:r>
+              <w:rPr>
+                <w:sz w:val="18"/>
+              </w:rPr>
+              <w:t>/admin/demandes-rgpd/purge-cloturees</w:t>
+            </w:r>
+          </w:p>
+        </w:tc>
+        <w:tc>
+          <w:tcPr>
+            <w:tcW w:type="dxa" w:w="2880"/>
+            <w:shd w:fill="E8EFF7" w:val="clear"/>
+          </w:tcPr>
+          <w:p>
+            <w:r>
+              <w:rPr>
+                <w:sz w:val="18"/>
+              </w:rPr>
+              <w:t>Purger les demandes traitees/rejetees</w:t>
+            </w:r>
+          </w:p>
+        </w:tc>
+      </w:tr>
+      <w:tr>
+        <w:tc>
+          <w:tcPr>
+            <w:tcW w:type="dxa" w:w="2880"/>
+          </w:tcPr>
+          <w:p>
+            <w:r>
+              <w:rPr>
+                <w:sz w:val="18"/>
+              </w:rPr>
+              <w:t>POST</w:t>
+            </w:r>
+          </w:p>
+        </w:tc>
+        <w:tc>
+          <w:tcPr>
+            <w:tcW w:type="dxa" w:w="2880"/>
+          </w:tcPr>
+          <w:p>
+            <w:r>
+              <w:rPr>
+                <w:sz w:val="18"/>
+              </w:rPr>
+              <w:t>/admin/questionnaires/</w:t>
+            </w:r>
+          </w:p>
+        </w:tc>
+        <w:tc>
+          <w:tcPr>
+            <w:tcW w:type="dxa" w:w="2880"/>
+          </w:tcPr>
+          <w:p>
+            <w:r>
+              <w:rPr>
+                <w:sz w:val="18"/>
+              </w:rPr>
+              <w:t>Créer un questionnaire</w:t>
+            </w:r>
+          </w:p>
+        </w:tc>
+      </w:tr>
+      <w:tr>
+        <w:tc>
+          <w:tcPr>
+            <w:tcW w:type="dxa" w:w="2880"/>
+            <w:shd w:fill="E8EFF7" w:val="clear"/>
+          </w:tcPr>
+          <w:p>
+            <w:r>
+              <w:rPr>
+                <w:sz w:val="18"/>
+              </w:rPr>
+              <w:t>GET</w:t>
+            </w:r>
+          </w:p>
+        </w:tc>
+        <w:tc>
+          <w:tcPr>
+            <w:tcW w:type="dxa" w:w="2880"/>
+            <w:shd w:fill="E8EFF7" w:val="clear"/>
+          </w:tcPr>
+          <w:p>
+            <w:r>
+              <w:rPr>
+                <w:sz w:val="18"/>
+              </w:rPr>
+              <w:t>/admin/questionnaires/</w:t>
+            </w:r>
+          </w:p>
+        </w:tc>
+        <w:tc>
+          <w:tcPr>
+            <w:tcW w:type="dxa" w:w="2880"/>
+            <w:shd w:fill="E8EFF7" w:val="clear"/>
+          </w:tcPr>
+          <w:p>
+            <w:r>
+              <w:rPr>
+                <w:sz w:val="18"/>
+              </w:rPr>
+              <w:t>Lister les questionnaires</w:t>
+            </w:r>
+          </w:p>
+        </w:tc>
+      </w:tr>
+      <w:tr>
+        <w:tc>
+          <w:tcPr>
+            <w:tcW w:type="dxa" w:w="2880"/>
+          </w:tcPr>
+          <w:p>
+            <w:r>
+              <w:rPr>
+                <w:sz w:val="18"/>
+              </w:rPr>
+              <w:t>GET</w:t>
+            </w:r>
+          </w:p>
+        </w:tc>
+        <w:tc>
+          <w:tcPr>
+            <w:tcW w:type="dxa" w:w="2880"/>
+          </w:tcPr>
+          <w:p>
+            <w:r>
+              <w:rPr>
+                <w:sz w:val="18"/>
+              </w:rPr>
+              <w:t>/admin/questionnaires/{id}</w:t>
+            </w:r>
+          </w:p>
+        </w:tc>
+        <w:tc>
+          <w:tcPr>
+            <w:tcW w:type="dxa" w:w="2880"/>
+          </w:tcPr>
+          <w:p>
+            <w:r>
+              <w:rPr>
+                <w:sz w:val="18"/>
+              </w:rPr>
+              <w:t>Détail d'un questionnaire</w:t>
+            </w:r>
+          </w:p>
+        </w:tc>
+      </w:tr>
+      <w:tr>
+        <w:tc>
+          <w:tcPr>
+            <w:tcW w:type="dxa" w:w="2880"/>
+            <w:shd w:fill="E8EFF7" w:val="clear"/>
+          </w:tcPr>
+          <w:p>
+            <w:r>
+              <w:rPr>
+                <w:sz w:val="18"/>
+              </w:rPr>
+              <w:t>PUT</w:t>
+            </w:r>
+          </w:p>
+        </w:tc>
+        <w:tc>
+          <w:tcPr>
+            <w:tcW w:type="dxa" w:w="2880"/>
+            <w:shd w:fill="E8EFF7" w:val="clear"/>
+          </w:tcPr>
+          <w:p>
+            <w:r>
+              <w:rPr>
+                <w:sz w:val="18"/>
+              </w:rPr>
+              <w:t>/admin/questionnaires/{id}</w:t>
+            </w:r>
+          </w:p>
+        </w:tc>
+        <w:tc>
+          <w:tcPr>
+            <w:tcW w:type="dxa" w:w="2880"/>
+            <w:shd w:fill="E8EFF7" w:val="clear"/>
+          </w:tcPr>
+          <w:p>
+            <w:r>
+              <w:rPr>
+                <w:sz w:val="18"/>
+              </w:rPr>
+              <w:t>Modifier un questionnaire</w:t>
+            </w:r>
+          </w:p>
+        </w:tc>
+      </w:tr>
+      <w:tr>
+        <w:tc>
+          <w:tcPr>
+            <w:tcW w:type="dxa" w:w="2880"/>
+          </w:tcPr>
+          <w:p>
+            <w:r>
+              <w:rPr>
+                <w:sz w:val="18"/>
+              </w:rPr>
+              <w:t>DELETE</w:t>
+            </w:r>
+          </w:p>
+        </w:tc>
+        <w:tc>
+          <w:tcPr>
+            <w:tcW w:type="dxa" w:w="2880"/>
+          </w:tcPr>
+          <w:p>
+            <w:r>
+              <w:rPr>
+                <w:sz w:val="18"/>
+              </w:rPr>
+              <w:t>/admin/questionnaires/{id}</w:t>
+            </w:r>
+          </w:p>
+        </w:tc>
+        <w:tc>
+          <w:tcPr>
+            <w:tcW w:type="dxa" w:w="2880"/>
+          </w:tcPr>
+          <w:p>
+            <w:r>
+              <w:rPr>
+                <w:sz w:val="18"/>
+              </w:rPr>
+              <w:t>Supprimer un questionnaire</w:t>
+            </w:r>
+          </w:p>
+        </w:tc>
+      </w:tr>
+      <w:tr>
+        <w:tc>
+          <w:tcPr>
+            <w:tcW w:type="dxa" w:w="2880"/>
+            <w:shd w:fill="E8EFF7" w:val="clear"/>
+          </w:tcPr>
+          <w:p>
+            <w:r>
+              <w:rPr>
+                <w:sz w:val="18"/>
+              </w:rPr>
+              <w:t>PATCH</w:t>
+            </w:r>
+          </w:p>
+        </w:tc>
+        <w:tc>
+          <w:tcPr>
+            <w:tcW w:type="dxa" w:w="2880"/>
+            <w:shd w:fill="E8EFF7" w:val="clear"/>
+          </w:tcPr>
+          <w:p>
+            <w:r>
+              <w:rPr>
+                <w:sz w:val="18"/>
+              </w:rPr>
+              <w:t>/admin/questionnaires/{id}/desactiver</w:t>
+            </w:r>
+          </w:p>
+        </w:tc>
+        <w:tc>
+          <w:tcPr>
+            <w:tcW w:type="dxa" w:w="2880"/>
+            <w:shd w:fill="E8EFF7" w:val="clear"/>
+          </w:tcPr>
+          <w:p>
+            <w:r>
+              <w:rPr>
+                <w:sz w:val="18"/>
+              </w:rPr>
+              <w:t>Désactiver un questionnaire</w:t>
+            </w:r>
+          </w:p>
+        </w:tc>
+      </w:tr>
+      <w:tr>
+        <w:tc>
+          <w:tcPr>
+            <w:tcW w:type="dxa" w:w="2880"/>
+          </w:tcPr>
+          <w:p>
+            <w:r>
+              <w:rPr>
+                <w:sz w:val="18"/>
+              </w:rPr>
+              <w:t>PATCH</w:t>
+            </w:r>
+          </w:p>
+        </w:tc>
+        <w:tc>
+          <w:tcPr>
+            <w:tcW w:type="dxa" w:w="2880"/>
+          </w:tcPr>
+          <w:p>
+            <w:r>
+              <w:rPr>
+                <w:sz w:val="18"/>
+              </w:rPr>
+              <w:t>/admin/questionnaires/{id}/reactiver</w:t>
+            </w:r>
+          </w:p>
+        </w:tc>
+        <w:tc>
+          <w:tcPr>
+            <w:tcW w:type="dxa" w:w="2880"/>
+          </w:tcPr>
+          <w:p>
+            <w:r>
+              <w:rPr>
+                <w:sz w:val="18"/>
+              </w:rPr>
+              <w:t>Réactiver un questionnaire</w:t>
+            </w:r>
+          </w:p>
+        </w:tc>
+      </w:tr>
+      <w:tr>
+        <w:tc>
+          <w:tcPr>
+            <w:tcW w:type="dxa" w:w="2880"/>
+            <w:shd w:fill="E8EFF7" w:val="clear"/>
+          </w:tcPr>
+          <w:p>
+            <w:r>
+              <w:rPr>
+                <w:sz w:val="18"/>
+              </w:rPr>
+              <w:t>POST</w:t>
+            </w:r>
+          </w:p>
+        </w:tc>
+        <w:tc>
+          <w:tcPr>
+            <w:tcW w:type="dxa" w:w="2880"/>
+            <w:shd w:fill="E8EFF7" w:val="clear"/>
+          </w:tcPr>
+          <w:p>
+            <w:r>
+              <w:rPr>
+                <w:sz w:val="18"/>
+              </w:rPr>
+              <w:t>/admin/questionnaires/notififier</w:t>
+            </w:r>
+          </w:p>
+        </w:tc>
+        <w:tc>
+          <w:tcPr>
+            <w:tcW w:type="dxa" w:w="2880"/>
+            <w:shd w:fill="E8EFF7" w:val="clear"/>
+          </w:tcPr>
+          <w:p>
+            <w:r>
+              <w:rPr>
+                <w:sz w:val="18"/>
+              </w:rPr>
+              <w:t>Notifier les alumni du questionnaire actif</w:t>
+            </w:r>
+          </w:p>
+        </w:tc>
+      </w:tr>
+      <w:tr>
+        <w:tc>
+          <w:tcPr>
+            <w:tcW w:type="dxa" w:w="2880"/>
+          </w:tcPr>
+          <w:p>
+            <w:r>
+              <w:rPr>
+                <w:sz w:val="18"/>
+              </w:rPr>
+              <w:t>GET</w:t>
+            </w:r>
+          </w:p>
+        </w:tc>
+        <w:tc>
+          <w:tcPr>
+            <w:tcW w:type="dxa" w:w="2880"/>
+          </w:tcPr>
+          <w:p>
+            <w:r>
+              <w:rPr>
+                <w:sz w:val="18"/>
+              </w:rPr>
+              <w:t>/admin/questionnaires/{id}/reponses</w:t>
+            </w:r>
+          </w:p>
+        </w:tc>
+        <w:tc>
+          <w:tcPr>
+            <w:tcW w:type="dxa" w:w="2880"/>
+          </w:tcPr>
+          <w:p>
+            <w:r>
+              <w:rPr>
+                <w:sz w:val="18"/>
+              </w:rPr>
+              <w:t>Voir les réponses</w:t>
+            </w:r>
+          </w:p>
+        </w:tc>
+      </w:tr>
+      <w:tr>
+        <w:tc>
+          <w:tcPr>
+            <w:tcW w:type="dxa" w:w="2880"/>
+            <w:shd w:fill="E8EFF7" w:val="clear"/>
+          </w:tcPr>
+          <w:p>
+            <w:r>
+              <w:rPr>
+                <w:sz w:val="18"/>
+              </w:rPr>
+              <w:t>GET</w:t>
+            </w:r>
+          </w:p>
+        </w:tc>
+        <w:tc>
+          <w:tcPr>
+            <w:tcW w:type="dxa" w:w="2880"/>
+            <w:shd w:fill="E8EFF7" w:val="clear"/>
+          </w:tcPr>
+          <w:p>
+            <w:r>
+              <w:rPr>
+                <w:sz w:val="18"/>
+              </w:rPr>
+              <w:t>/questionnaires/actif</w:t>
+            </w:r>
+          </w:p>
+        </w:tc>
+        <w:tc>
+          <w:tcPr>
+            <w:tcW w:type="dxa" w:w="2880"/>
+            <w:shd w:fill="E8EFF7" w:val="clear"/>
+          </w:tcPr>
+          <w:p>
+            <w:r>
+              <w:rPr>
+                <w:sz w:val="18"/>
+              </w:rPr>
+              <w:t>Questionnaire actif (alumni)</w:t>
+            </w:r>
+          </w:p>
+        </w:tc>
+      </w:tr>
+      <w:tr>
+        <w:tc>
+          <w:tcPr>
+            <w:tcW w:type="dxa" w:w="2880"/>
+          </w:tcPr>
+          <w:p>
+            <w:r>
+              <w:rPr>
+                <w:sz w:val="18"/>
+              </w:rPr>
+              <w:t>GET</w:t>
+            </w:r>
+          </w:p>
+        </w:tc>
+        <w:tc>
+          <w:tcPr>
+            <w:tcW w:type="dxa" w:w="2880"/>
+          </w:tcPr>
+          <w:p>
+            <w:r>
+              <w:rPr>
+                <w:sz w:val="18"/>
+              </w:rPr>
+              <w:t>/questionnaires/etudiant/{id}/reponses</w:t>
+            </w:r>
+          </w:p>
+        </w:tc>
+        <w:tc>
+          <w:tcPr>
+            <w:tcW w:type="dxa" w:w="2880"/>
+          </w:tcPr>
+          <w:p>
+            <w:r>
+              <w:rPr>
+                <w:sz w:val="18"/>
+              </w:rPr>
+              <w:t>Mes réponses (alumni)</w:t>
+            </w:r>
+          </w:p>
+        </w:tc>
+      </w:tr>
+      <w:tr>
+        <w:tc>
+          <w:tcPr>
+            <w:tcW w:type="dxa" w:w="2880"/>
+            <w:shd w:fill="E8EFF7" w:val="clear"/>
+          </w:tcPr>
+          <w:p>
+            <w:r>
+              <w:rPr>
+                <w:sz w:val="18"/>
+              </w:rPr>
+              <w:t>POST</w:t>
+            </w:r>
+          </w:p>
+        </w:tc>
+        <w:tc>
+          <w:tcPr>
+            <w:tcW w:type="dxa" w:w="2880"/>
+            <w:shd w:fill="E8EFF7" w:val="clear"/>
+          </w:tcPr>
+          <w:p>
+            <w:r>
+              <w:rPr>
+                <w:sz w:val="18"/>
+              </w:rPr>
+              <w:t>/questionnaires/{id}/repondre</w:t>
+            </w:r>
+          </w:p>
+        </w:tc>
+        <w:tc>
+          <w:tcPr>
+            <w:tcW w:type="dxa" w:w="2880"/>
+            <w:shd w:fill="E8EFF7" w:val="clear"/>
+          </w:tcPr>
+          <w:p>
+            <w:r>
+              <w:rPr>
+                <w:sz w:val="18"/>
+              </w:rPr>
+              <w:t>Répondre au questionnaire (alumni)</w:t>
+            </w:r>
+          </w:p>
+        </w:tc>
+      </w:tr>
+      <w:tr>
+        <w:tc>
+          <w:tcPr>
+            <w:tcW w:type="dxa" w:w="2880"/>
+          </w:tcPr>
+          <w:p>
+            <w:r>
+              <w:rPr>
+                <w:sz w:val="18"/>
+              </w:rPr>
+              <w:t>POST</w:t>
+            </w:r>
+          </w:p>
+        </w:tc>
+        <w:tc>
+          <w:tcPr>
+            <w:tcW w:type="dxa" w:w="2880"/>
+          </w:tcPr>
+          <w:p>
+            <w:r>
+              <w:rPr>
+                <w:sz w:val="18"/>
+              </w:rPr>
+              <w:t>/import/excel</w:t>
+            </w:r>
+          </w:p>
+        </w:tc>
+        <w:tc>
+          <w:tcPr>
+            <w:tcW w:type="dxa" w:w="2880"/>
+          </w:tcPr>
+          <w:p>
+            <w:r>
+              <w:rPr>
+                <w:sz w:val="18"/>
+              </w:rPr>
+              <w:t>Importer des alumni depuis Excel</w:t>
+            </w:r>
+          </w:p>
+        </w:tc>
+      </w:tr>
+      <w:tr>
+        <w:tc>
+          <w:tcPr>
+            <w:tcW w:type="dxa" w:w="2880"/>
+            <w:shd w:fill="E8EFF7" w:val="clear"/>
+          </w:tcPr>
+          <w:p>
+            <w:r>
+              <w:rPr>
+                <w:sz w:val="18"/>
+              </w:rPr>
+              <w:t>GET</w:t>
+            </w:r>
+          </w:p>
+        </w:tc>
+        <w:tc>
+          <w:tcPr>
+            <w:tcW w:type="dxa" w:w="2880"/>
+            <w:shd w:fill="E8EFF7" w:val="clear"/>
+          </w:tcPr>
+          <w:p>
+            <w:r>
+              <w:rPr>
+                <w:sz w:val="18"/>
+              </w:rPr>
+              <w:t>/import/template</w:t>
+            </w:r>
+          </w:p>
+        </w:tc>
+        <w:tc>
+          <w:tcPr>
+            <w:tcW w:type="dxa" w:w="2880"/>
+            <w:shd w:fill="E8EFF7" w:val="clear"/>
+          </w:tcPr>
+          <w:p>
+            <w:r>
+              <w:rPr>
+                <w:sz w:val="18"/>
+              </w:rPr>
+              <w:t>Télécharger le template d'import</w:t>
+            </w:r>
+          </w:p>
+        </w:tc>
+      </w:tr>
+      <w:tr>
+        <w:tc>
+          <w:tcPr>
+            <w:tcW w:type="dxa" w:w="2880"/>
+          </w:tcPr>
+          <w:p>
+            <w:r>
+              <w:rPr>
+                <w:sz w:val="18"/>
+              </w:rPr>
+              <w:t>GET</w:t>
+            </w:r>
+          </w:p>
+        </w:tc>
+        <w:tc>
+          <w:tcPr>
+            <w:tcW w:type="dxa" w:w="2880"/>
+          </w:tcPr>
+          <w:p>
+            <w:r>
+              <w:rPr>
+                <w:sz w:val="18"/>
+              </w:rPr>
+              <w:t>/import/export/alumni</w:t>
+            </w:r>
+          </w:p>
+        </w:tc>
+        <w:tc>
+          <w:tcPr>
+            <w:tcW w:type="dxa" w:w="2880"/>
+          </w:tcPr>
+          <w:p>
+            <w:r>
+              <w:rPr>
+                <w:sz w:val="18"/>
+              </w:rPr>
+              <w:t>Exporter tous les alumni en Excel</w:t>
+            </w:r>
+          </w:p>
+        </w:tc>
+      </w:tr>
+      <w:tr>
+        <w:tc>
+          <w:tcPr>
+            <w:tcW w:type="dxa" w:w="2880"/>
+            <w:shd w:fill="E8EFF7" w:val="clear"/>
+          </w:tcPr>
+          <w:p>
+            <w:r>
+              <w:rPr>
+                <w:sz w:val="18"/>
+              </w:rPr>
+              <w:t>POST</w:t>
+            </w:r>
+          </w:p>
+        </w:tc>
+        <w:tc>
+          <w:tcPr>
+            <w:tcW w:type="dxa" w:w="2880"/>
+            <w:shd w:fill="E8EFF7" w:val="clear"/>
+          </w:tcPr>
+          <w:p>
+            <w:r>
+              <w:rPr>
+                <w:sz w:val="18"/>
+              </w:rPr>
               <w:t>/upload-etudiants/</w:t>
             </w:r>
           </w:p>
@@ -5401,6 +6645,7 @@
         <w:tc>
           <w:tcPr>
             <w:tcW w:type="dxa" w:w="2880"/>
+            <w:shd w:fill="E8EFF7" w:val="clear"/>
           </w:tcPr>
           <w:p>
             <w:r>
@@ -5408,6 +6653,47 @@
                 <w:sz w:val="18"/>
               </w:rPr>
               <w:t>Import CSV/Excel (automatisation)</w:t>
+            </w:r>
+          </w:p>
+        </w:tc>
+      </w:tr>
+      <w:tr>
+        <w:tc>
+          <w:tcPr>
+            <w:tcW w:type="dxa" w:w="2880"/>
+          </w:tcPr>
+          <w:p>
+            <w:r>
+              <w:rPr>
+                <w:sz w:val="18"/>
+              </w:rPr>
+              <w:t>POST</w:t>
+            </w:r>
+          </w:p>
+        </w:tc>
+        <w:tc>
+          <w:tcPr>
+            <w:tcW w:type="dxa" w:w="2880"/>
+          </w:tcPr>
+          <w:p>
+            <w:r>
+              <w:rPr>
+                <w:sz w:val="18"/>
+              </w:rPr>
+              <w:t>/newsletter/envoyer</w:t>
+            </w:r>
+          </w:p>
+        </w:tc>
+        <w:tc>
+          <w:tcPr>
+            <w:tcW w:type="dxa" w:w="2880"/>
+          </w:tcPr>
+          <w:p>
+            <w:r>
+              <w:rPr>
+                <w:sz w:val="18"/>
+              </w:rPr>
+              <w:t>Newsletter aux alumni consentants (admin)</w:t>
             </w:r>
           </w:p>
         </w:tc>

</xml_diff>